<commit_message>
Actualisación documento de diseño v1.4
</commit_message>
<xml_diff>
--- a/Documentacion/DisenoArquitectura.docx
+++ b/Documentacion/DisenoArquitectura.docx
@@ -128,7 +128,16 @@
           <w:szCs w:val="26"/>
           <w:rtl w:val="0"/>
         </w:rPr>
-        <w:t xml:space="preserve">Versión 1.0</w:t>
+        <w:t xml:space="preserve">Versión 1.</w:t>
+      </w:r>
+      <w:r>
+        <w:rPr>
+          <w:color w:val="7f8c8d"/>
+          <w:sz w:val="26"/>
+          <w:szCs w:val="26"/>
+          <w:rtl w:val="0"/>
+        </w:rPr>
+        <w:t xml:space="preserve">4</w:t>
       </w:r>
       <w:r>
         <w:rPr>
@@ -262,7 +271,7 @@
           <w:szCs w:val="20"/>
           <w:rtl w:val="0"/>
         </w:rPr>
-        <w:t xml:space="preserve">12 de abril de 2026</w:t>
+        <w:t xml:space="preserve">13 de abril de 2026</w:t>
       </w:r>
     </w:p>
     <w:p>
@@ -1146,8 +1155,12 @@
             </w:pPr>
             <w:r>
               <w:rPr>
-                <w:rtl w:val="0"/>
-              </w:rPr>
+                <w:color w:val="000000"/>
+                <w:sz w:val="20"/>
+                <w:szCs w:val="20"/>
+                <w:rtl w:val="0"/>
+              </w:rPr>
+              <w:t xml:space="preserve">Juliana</w:t>
             </w:r>
           </w:p>
         </w:tc>
@@ -1177,8 +1190,12 @@
             </w:pPr>
             <w:r>
               <w:rPr>
-                <w:rtl w:val="0"/>
-              </w:rPr>
+                <w:color w:val="000000"/>
+                <w:sz w:val="20"/>
+                <w:szCs w:val="20"/>
+                <w:rtl w:val="0"/>
+              </w:rPr>
+              <w:t xml:space="preserve">13/04/2026</w:t>
             </w:r>
           </w:p>
         </w:tc>
@@ -1208,8 +1225,12 @@
             </w:pPr>
             <w:r>
               <w:rPr>
-                <w:rtl w:val="0"/>
-              </w:rPr>
+                <w:color w:val="000000"/>
+                <w:sz w:val="20"/>
+                <w:szCs w:val="20"/>
+                <w:rtl w:val="0"/>
+              </w:rPr>
+              <w:t xml:space="preserve">Desarrollo de sección 2: Diagrama de contexto, Diagrama de contenedores. Elementos del diagrama</w:t>
             </w:r>
           </w:p>
         </w:tc>
@@ -1239,8 +1260,12 @@
             </w:pPr>
             <w:r>
               <w:rPr>
-                <w:rtl w:val="0"/>
-              </w:rPr>
+                <w:color w:val="000000"/>
+                <w:sz w:val="20"/>
+                <w:szCs w:val="20"/>
+                <w:rtl w:val="0"/>
+              </w:rPr>
+              <w:t xml:space="preserve">1.4</w:t>
             </w:r>
           </w:p>
         </w:tc>
@@ -3840,12 +3865,12 @@
           <wp:inline distB="114300" distT="114300" distL="114300" distR="114300">
             <wp:extent cx="5943600" cy="3124200"/>
             <wp:effectExtent b="0" l="0" r="0" t="0"/>
-            <wp:docPr id="1" name="image2.jpg"/>
+            <wp:docPr id="1" name="image3.jpg"/>
             <a:graphic>
               <a:graphicData uri="http://schemas.openxmlformats.org/drawingml/2006/picture">
                 <pic:pic>
                   <pic:nvPicPr>
-                    <pic:cNvPr id="0" name="image2.jpg"/>
+                    <pic:cNvPr id="0" name="image3.jpg"/>
                     <pic:cNvPicPr preferRelativeResize="0"/>
                   </pic:nvPicPr>
                   <pic:blipFill>
@@ -4077,59 +4102,62 @@
               <w:bottom w:color="bdc3c7" w:space="0" w:sz="4" w:val="single"/>
               <w:right w:color="bdc3c7" w:space="0" w:sz="4" w:val="single"/>
             </w:tcBorders>
-            <w:shd w:fill="ffffff" w:val="clear"/>
-            <w:tcMar>
-              <w:top w:w="80.0" w:type="dxa"/>
-              <w:left w:w="140.0" w:type="dxa"/>
-              <w:bottom w:w="80.0" w:type="dxa"/>
-              <w:right w:w="140.0" w:type="dxa"/>
-            </w:tcMar>
-          </w:tcPr>
-          <w:p>
-            <w:pPr>
-              <w:rPr/>
-            </w:pPr>
-            <w:r>
-              <w:rPr>
-                <w:rFonts w:ascii="Arial" w:cs="Arial" w:eastAsia="Arial" w:hAnsi="Arial"/>
-                <w:color w:val="1a1a2e"/>
-                <w:sz w:val="20"/>
-                <w:szCs w:val="20"/>
-                <w:rtl w:val="0"/>
-              </w:rPr>
-              <w:t xml:space="preserve">[Nombre del Sistema]</w:t>
-            </w:r>
-            <w:r>
-              <w:rPr>
-                <w:rtl w:val="0"/>
-              </w:rPr>
-            </w:r>
-          </w:p>
-        </w:tc>
-        <w:tc>
-          <w:tcPr>
-            <w:tcBorders>
-              <w:top w:color="bdc3c7" w:space="0" w:sz="4" w:val="single"/>
-              <w:left w:color="bdc3c7" w:space="0" w:sz="4" w:val="single"/>
-              <w:bottom w:color="bdc3c7" w:space="0" w:sz="4" w:val="single"/>
-              <w:right w:color="bdc3c7" w:space="0" w:sz="4" w:val="single"/>
-            </w:tcBorders>
-            <w:shd w:fill="ffffff" w:val="clear"/>
-            <w:tcMar>
-              <w:top w:w="80.0" w:type="dxa"/>
-              <w:left w:w="140.0" w:type="dxa"/>
-              <w:bottom w:w="80.0" w:type="dxa"/>
-              <w:right w:w="140.0" w:type="dxa"/>
-            </w:tcMar>
-          </w:tcPr>
-          <w:p>
-            <w:pPr>
-              <w:rPr/>
-            </w:pPr>
-            <w:r>
-              <w:rPr>
-                <w:rFonts w:ascii="Arial" w:cs="Arial" w:eastAsia="Arial" w:hAnsi="Arial"/>
-                <w:color w:val="1a1a2e"/>
+            <w:shd w:fill="2c6b7d" w:val="clear"/>
+            <w:tcMar>
+              <w:top w:w="80.0" w:type="dxa"/>
+              <w:left w:w="140.0" w:type="dxa"/>
+              <w:bottom w:w="80.0" w:type="dxa"/>
+              <w:right w:w="140.0" w:type="dxa"/>
+            </w:tcMar>
+          </w:tcPr>
+          <w:p>
+            <w:pPr>
+              <w:rPr>
+                <w:color w:val="ffffff"/>
+              </w:rPr>
+            </w:pPr>
+            <w:r>
+              <w:rPr>
+                <w:color w:val="ffffff"/>
+                <w:sz w:val="20"/>
+                <w:szCs w:val="20"/>
+                <w:rtl w:val="0"/>
+              </w:rPr>
+              <w:t xml:space="preserve">LeetCode Clon</w:t>
+            </w:r>
+            <w:r>
+              <w:rPr>
+                <w:rtl w:val="0"/>
+              </w:rPr>
+            </w:r>
+          </w:p>
+        </w:tc>
+        <w:tc>
+          <w:tcPr>
+            <w:tcBorders>
+              <w:top w:color="bdc3c7" w:space="0" w:sz="4" w:val="single"/>
+              <w:left w:color="bdc3c7" w:space="0" w:sz="4" w:val="single"/>
+              <w:bottom w:color="bdc3c7" w:space="0" w:sz="4" w:val="single"/>
+              <w:right w:color="bdc3c7" w:space="0" w:sz="4" w:val="single"/>
+            </w:tcBorders>
+            <w:shd w:fill="2c6b7d" w:val="clear"/>
+            <w:tcMar>
+              <w:top w:w="80.0" w:type="dxa"/>
+              <w:left w:w="140.0" w:type="dxa"/>
+              <w:bottom w:w="80.0" w:type="dxa"/>
+              <w:right w:w="140.0" w:type="dxa"/>
+            </w:tcMar>
+          </w:tcPr>
+          <w:p>
+            <w:pPr>
+              <w:rPr>
+                <w:color w:val="ffffff"/>
+              </w:rPr>
+            </w:pPr>
+            <w:r>
+              <w:rPr>
+                <w:rFonts w:ascii="Arial" w:cs="Arial" w:eastAsia="Arial" w:hAnsi="Arial"/>
+                <w:color w:val="ffffff"/>
                 <w:sz w:val="20"/>
                 <w:szCs w:val="20"/>
                 <w:rtl w:val="0"/>
@@ -4151,34 +4179,30 @@
               <w:bottom w:color="bdc3c7" w:space="0" w:sz="4" w:val="single"/>
               <w:right w:color="bdc3c7" w:space="0" w:sz="4" w:val="single"/>
             </w:tcBorders>
-            <w:shd w:fill="f1f3f4" w:val="clear"/>
-            <w:tcMar>
-              <w:top w:w="80.0" w:type="dxa"/>
-              <w:left w:w="140.0" w:type="dxa"/>
-              <w:bottom w:w="80.0" w:type="dxa"/>
-              <w:right w:w="140.0" w:type="dxa"/>
-            </w:tcMar>
-          </w:tcPr>
-          <w:p>
-            <w:pPr>
-              <w:rPr/>
-            </w:pPr>
-            <w:r>
-              <w:rPr>
-                <w:rFonts w:ascii="Arial Unicode MS" w:cs="Arial Unicode MS" w:eastAsia="Arial Unicode MS" w:hAnsi="Arial Unicode MS"/>
-                <w:i w:val="1"/>
-                <w:iCs w:val="1"/>
-                <w:color w:val="888888"/>
-                <w:sz w:val="20"/>
-                <w:szCs w:val="20"/>
-                <w:rtl w:val="0"/>
-              </w:rPr>
-              <w:t xml:space="preserve">✏  Descripción breve del sistema</w:t>
-            </w:r>
-            <w:r>
-              <w:rPr>
-                <w:rtl w:val="0"/>
-              </w:rPr>
+            <w:shd w:fill="2c6b7d" w:val="clear"/>
+            <w:tcMar>
+              <w:top w:w="80.0" w:type="dxa"/>
+              <w:left w:w="140.0" w:type="dxa"/>
+              <w:bottom w:w="80.0" w:type="dxa"/>
+              <w:right w:w="140.0" w:type="dxa"/>
+            </w:tcMar>
+          </w:tcPr>
+          <w:p>
+            <w:pPr>
+              <w:rPr>
+                <w:color w:val="ffffff"/>
+                <w:sz w:val="20"/>
+                <w:szCs w:val="20"/>
+              </w:rPr>
+            </w:pPr>
+            <w:r>
+              <w:rPr>
+                <w:color w:val="ffffff"/>
+                <w:sz w:val="20"/>
+                <w:szCs w:val="20"/>
+                <w:rtl w:val="0"/>
+              </w:rPr>
+              <w:t xml:space="preserve">Procesa la lógica, la ejecución de código y gestiona el catálogo de problemas</w:t>
             </w:r>
           </w:p>
         </w:tc>
@@ -4196,59 +4220,59 @@
               <w:bottom w:color="bdc3c7" w:space="0" w:sz="4" w:val="single"/>
               <w:right w:color="bdc3c7" w:space="0" w:sz="4" w:val="single"/>
             </w:tcBorders>
-            <w:shd w:fill="f5f7fa" w:val="clear"/>
-            <w:tcMar>
-              <w:top w:w="80.0" w:type="dxa"/>
-              <w:left w:w="140.0" w:type="dxa"/>
-              <w:bottom w:w="80.0" w:type="dxa"/>
-              <w:right w:w="140.0" w:type="dxa"/>
-            </w:tcMar>
-          </w:tcPr>
-          <w:p>
-            <w:pPr>
-              <w:rPr/>
-            </w:pPr>
-            <w:r>
-              <w:rPr>
-                <w:rFonts w:ascii="Arial" w:cs="Arial" w:eastAsia="Arial" w:hAnsi="Arial"/>
-                <w:color w:val="1a1a2e"/>
-                <w:sz w:val="20"/>
-                <w:szCs w:val="20"/>
-                <w:rtl w:val="0"/>
-              </w:rPr>
-              <w:t xml:space="preserve">Estudiante / Usuario</w:t>
-            </w:r>
-            <w:r>
-              <w:rPr>
-                <w:rtl w:val="0"/>
-              </w:rPr>
-            </w:r>
-          </w:p>
-        </w:tc>
-        <w:tc>
-          <w:tcPr>
-            <w:tcBorders>
-              <w:top w:color="bdc3c7" w:space="0" w:sz="4" w:val="single"/>
-              <w:left w:color="bdc3c7" w:space="0" w:sz="4" w:val="single"/>
-              <w:bottom w:color="bdc3c7" w:space="0" w:sz="4" w:val="single"/>
-              <w:right w:color="bdc3c7" w:space="0" w:sz="4" w:val="single"/>
-            </w:tcBorders>
-            <w:shd w:fill="f5f7fa" w:val="clear"/>
-            <w:tcMar>
-              <w:top w:w="80.0" w:type="dxa"/>
-              <w:left w:w="140.0" w:type="dxa"/>
-              <w:bottom w:w="80.0" w:type="dxa"/>
-              <w:right w:w="140.0" w:type="dxa"/>
-            </w:tcMar>
-          </w:tcPr>
-          <w:p>
-            <w:pPr>
-              <w:rPr/>
-            </w:pPr>
-            <w:r>
-              <w:rPr>
-                <w:rFonts w:ascii="Arial" w:cs="Arial" w:eastAsia="Arial" w:hAnsi="Arial"/>
-                <w:color w:val="1a1a2e"/>
+            <w:shd w:fill="036e8e" w:val="clear"/>
+            <w:tcMar>
+              <w:top w:w="80.0" w:type="dxa"/>
+              <w:left w:w="140.0" w:type="dxa"/>
+              <w:bottom w:w="80.0" w:type="dxa"/>
+              <w:right w:w="140.0" w:type="dxa"/>
+            </w:tcMar>
+          </w:tcPr>
+          <w:p>
+            <w:pPr>
+              <w:rPr>
+                <w:color w:val="ffffff"/>
+                <w:sz w:val="20"/>
+                <w:szCs w:val="20"/>
+              </w:rPr>
+            </w:pPr>
+            <w:r>
+              <w:rPr>
+                <w:color w:val="ffffff"/>
+                <w:sz w:val="20"/>
+                <w:szCs w:val="20"/>
+                <w:rtl w:val="0"/>
+              </w:rPr>
+              <w:t xml:space="preserve">Administrador</w:t>
+            </w:r>
+          </w:p>
+        </w:tc>
+        <w:tc>
+          <w:tcPr>
+            <w:tcBorders>
+              <w:top w:color="bdc3c7" w:space="0" w:sz="4" w:val="single"/>
+              <w:left w:color="bdc3c7" w:space="0" w:sz="4" w:val="single"/>
+              <w:bottom w:color="bdc3c7" w:space="0" w:sz="4" w:val="single"/>
+              <w:right w:color="bdc3c7" w:space="0" w:sz="4" w:val="single"/>
+            </w:tcBorders>
+            <w:shd w:fill="036e8e" w:val="clear"/>
+            <w:tcMar>
+              <w:top w:w="80.0" w:type="dxa"/>
+              <w:left w:w="140.0" w:type="dxa"/>
+              <w:bottom w:w="80.0" w:type="dxa"/>
+              <w:right w:w="140.0" w:type="dxa"/>
+            </w:tcMar>
+          </w:tcPr>
+          <w:p>
+            <w:pPr>
+              <w:rPr>
+                <w:color w:val="ffffff"/>
+              </w:rPr>
+            </w:pPr>
+            <w:r>
+              <w:rPr>
+                <w:rFonts w:ascii="Arial" w:cs="Arial" w:eastAsia="Arial" w:hAnsi="Arial"/>
+                <w:color w:val="ffffff"/>
                 <w:sz w:val="20"/>
                 <w:szCs w:val="20"/>
                 <w:rtl w:val="0"/>
@@ -4270,32 +4294,30 @@
               <w:bottom w:color="bdc3c7" w:space="0" w:sz="4" w:val="single"/>
               <w:right w:color="bdc3c7" w:space="0" w:sz="4" w:val="single"/>
             </w:tcBorders>
-            <w:shd w:fill="f5f7fa" w:val="clear"/>
-            <w:tcMar>
-              <w:top w:w="80.0" w:type="dxa"/>
-              <w:left w:w="140.0" w:type="dxa"/>
-              <w:bottom w:w="80.0" w:type="dxa"/>
-              <w:right w:w="140.0" w:type="dxa"/>
-            </w:tcMar>
-          </w:tcPr>
-          <w:p>
-            <w:pPr>
-              <w:rPr/>
-            </w:pPr>
-            <w:r>
-              <w:rPr>
-                <w:rFonts w:ascii="Arial" w:cs="Arial" w:eastAsia="Arial" w:hAnsi="Arial"/>
-                <w:color w:val="1a1a2e"/>
-                <w:sz w:val="20"/>
-                <w:szCs w:val="20"/>
-                <w:rtl w:val="0"/>
-              </w:rPr>
-              <w:t xml:space="preserve">Usuario principal que accede a la plataforma</w:t>
-            </w:r>
-            <w:r>
-              <w:rPr>
-                <w:rtl w:val="0"/>
-              </w:rPr>
+            <w:shd w:fill="036e8e" w:val="clear"/>
+            <w:tcMar>
+              <w:top w:w="80.0" w:type="dxa"/>
+              <w:left w:w="140.0" w:type="dxa"/>
+              <w:bottom w:w="80.0" w:type="dxa"/>
+              <w:right w:w="140.0" w:type="dxa"/>
+            </w:tcMar>
+          </w:tcPr>
+          <w:p>
+            <w:pPr>
+              <w:rPr>
+                <w:color w:val="ffffff"/>
+                <w:sz w:val="20"/>
+                <w:szCs w:val="20"/>
+              </w:rPr>
+            </w:pPr>
+            <w:r>
+              <w:rPr>
+                <w:color w:val="ffffff"/>
+                <w:sz w:val="20"/>
+                <w:szCs w:val="20"/>
+                <w:rtl w:val="0"/>
+              </w:rPr>
+              <w:t xml:space="preserve">Gestiona problemas, categorías y casos de prueba. Administra retos y casos de prueba vía HTTPS</w:t>
             </w:r>
           </w:p>
         </w:tc>
@@ -4313,59 +4335,62 @@
               <w:bottom w:color="bdc3c7" w:space="0" w:sz="4" w:val="single"/>
               <w:right w:color="bdc3c7" w:space="0" w:sz="4" w:val="single"/>
             </w:tcBorders>
-            <w:shd w:fill="ffffff" w:val="clear"/>
-            <w:tcMar>
-              <w:top w:w="80.0" w:type="dxa"/>
-              <w:left w:w="140.0" w:type="dxa"/>
-              <w:bottom w:w="80.0" w:type="dxa"/>
-              <w:right w:w="140.0" w:type="dxa"/>
-            </w:tcMar>
-          </w:tcPr>
-          <w:p>
-            <w:pPr>
-              <w:rPr/>
-            </w:pPr>
-            <w:r>
-              <w:rPr>
-                <w:rFonts w:ascii="Arial" w:cs="Arial" w:eastAsia="Arial" w:hAnsi="Arial"/>
-                <w:color w:val="1a1a2e"/>
-                <w:sz w:val="20"/>
-                <w:szCs w:val="20"/>
-                <w:rtl w:val="0"/>
-              </w:rPr>
-              <w:t xml:space="preserve">Administrador</w:t>
-            </w:r>
-            <w:r>
-              <w:rPr>
-                <w:rtl w:val="0"/>
-              </w:rPr>
-            </w:r>
-          </w:p>
-        </w:tc>
-        <w:tc>
-          <w:tcPr>
-            <w:tcBorders>
-              <w:top w:color="bdc3c7" w:space="0" w:sz="4" w:val="single"/>
-              <w:left w:color="bdc3c7" w:space="0" w:sz="4" w:val="single"/>
-              <w:bottom w:color="bdc3c7" w:space="0" w:sz="4" w:val="single"/>
-              <w:right w:color="bdc3c7" w:space="0" w:sz="4" w:val="single"/>
-            </w:tcBorders>
-            <w:shd w:fill="ffffff" w:val="clear"/>
-            <w:tcMar>
-              <w:top w:w="80.0" w:type="dxa"/>
-              <w:left w:w="140.0" w:type="dxa"/>
-              <w:bottom w:w="80.0" w:type="dxa"/>
-              <w:right w:w="140.0" w:type="dxa"/>
-            </w:tcMar>
-          </w:tcPr>
-          <w:p>
-            <w:pPr>
-              <w:rPr/>
-            </w:pPr>
-            <w:r>
-              <w:rPr>
-                <w:rFonts w:ascii="Arial" w:cs="Arial" w:eastAsia="Arial" w:hAnsi="Arial"/>
-                <w:color w:val="1a1a2e"/>
+            <w:shd w:fill="036e8e" w:val="clear"/>
+            <w:tcMar>
+              <w:top w:w="80.0" w:type="dxa"/>
+              <w:left w:w="140.0" w:type="dxa"/>
+              <w:bottom w:w="80.0" w:type="dxa"/>
+              <w:right w:w="140.0" w:type="dxa"/>
+            </w:tcMar>
+          </w:tcPr>
+          <w:p>
+            <w:pPr>
+              <w:rPr>
+                <w:color w:val="ffffff"/>
+              </w:rPr>
+            </w:pPr>
+            <w:r>
+              <w:rPr>
+                <w:color w:val="ffffff"/>
+                <w:sz w:val="20"/>
+                <w:szCs w:val="20"/>
+                <w:rtl w:val="0"/>
+              </w:rPr>
+              <w:t xml:space="preserve">Programador</w:t>
+            </w:r>
+            <w:r>
+              <w:rPr>
+                <w:rtl w:val="0"/>
+              </w:rPr>
+            </w:r>
+          </w:p>
+        </w:tc>
+        <w:tc>
+          <w:tcPr>
+            <w:tcBorders>
+              <w:top w:color="bdc3c7" w:space="0" w:sz="4" w:val="single"/>
+              <w:left w:color="bdc3c7" w:space="0" w:sz="4" w:val="single"/>
+              <w:bottom w:color="bdc3c7" w:space="0" w:sz="4" w:val="single"/>
+              <w:right w:color="bdc3c7" w:space="0" w:sz="4" w:val="single"/>
+            </w:tcBorders>
+            <w:shd w:fill="036e8e" w:val="clear"/>
+            <w:tcMar>
+              <w:top w:w="80.0" w:type="dxa"/>
+              <w:left w:w="140.0" w:type="dxa"/>
+              <w:bottom w:w="80.0" w:type="dxa"/>
+              <w:right w:w="140.0" w:type="dxa"/>
+            </w:tcMar>
+          </w:tcPr>
+          <w:p>
+            <w:pPr>
+              <w:rPr>
+                <w:color w:val="ffffff"/>
+              </w:rPr>
+            </w:pPr>
+            <w:r>
+              <w:rPr>
+                <w:rFonts w:ascii="Arial" w:cs="Arial" w:eastAsia="Arial" w:hAnsi="Arial"/>
+                <w:color w:val="ffffff"/>
                 <w:sz w:val="20"/>
                 <w:szCs w:val="20"/>
                 <w:rtl w:val="0"/>
@@ -4387,32 +4412,30 @@
               <w:bottom w:color="bdc3c7" w:space="0" w:sz="4" w:val="single"/>
               <w:right w:color="bdc3c7" w:space="0" w:sz="4" w:val="single"/>
             </w:tcBorders>
-            <w:shd w:fill="ffffff" w:val="clear"/>
-            <w:tcMar>
-              <w:top w:w="80.0" w:type="dxa"/>
-              <w:left w:w="140.0" w:type="dxa"/>
-              <w:bottom w:w="80.0" w:type="dxa"/>
-              <w:right w:w="140.0" w:type="dxa"/>
-            </w:tcMar>
-          </w:tcPr>
-          <w:p>
-            <w:pPr>
-              <w:rPr/>
-            </w:pPr>
-            <w:r>
-              <w:rPr>
-                <w:rFonts w:ascii="Arial" w:cs="Arial" w:eastAsia="Arial" w:hAnsi="Arial"/>
-                <w:color w:val="1a1a2e"/>
-                <w:sz w:val="20"/>
-                <w:szCs w:val="20"/>
-                <w:rtl w:val="0"/>
-              </w:rPr>
-              <w:t xml:space="preserve">Gestiona contenidos y usuarios del sistema</w:t>
-            </w:r>
-            <w:r>
-              <w:rPr>
-                <w:rtl w:val="0"/>
-              </w:rPr>
+            <w:shd w:fill="036e8e" w:val="clear"/>
+            <w:tcMar>
+              <w:top w:w="80.0" w:type="dxa"/>
+              <w:left w:w="140.0" w:type="dxa"/>
+              <w:bottom w:w="80.0" w:type="dxa"/>
+              <w:right w:w="140.0" w:type="dxa"/>
+            </w:tcMar>
+          </w:tcPr>
+          <w:p>
+            <w:pPr>
+              <w:rPr>
+                <w:color w:val="ffffff"/>
+                <w:sz w:val="20"/>
+                <w:szCs w:val="20"/>
+              </w:rPr>
+            </w:pPr>
+            <w:r>
+              <w:rPr>
+                <w:color w:val="ffffff"/>
+                <w:sz w:val="20"/>
+                <w:szCs w:val="20"/>
+                <w:rtl w:val="0"/>
+              </w:rPr>
+              <w:t xml:space="preserve">Resuelve retos, realiza envíos y consulta sus propios resultados.</w:t>
             </w:r>
           </w:p>
         </w:tc>
@@ -4430,59 +4453,59 @@
               <w:bottom w:color="bdc3c7" w:space="0" w:sz="4" w:val="single"/>
               <w:right w:color="bdc3c7" w:space="0" w:sz="4" w:val="single"/>
             </w:tcBorders>
-            <w:shd w:fill="f5f7fa" w:val="clear"/>
-            <w:tcMar>
-              <w:top w:w="80.0" w:type="dxa"/>
-              <w:left w:w="140.0" w:type="dxa"/>
-              <w:bottom w:w="80.0" w:type="dxa"/>
-              <w:right w:w="140.0" w:type="dxa"/>
-            </w:tcMar>
-          </w:tcPr>
-          <w:p>
-            <w:pPr>
-              <w:rPr/>
-            </w:pPr>
-            <w:r>
-              <w:rPr>
-                <w:rFonts w:ascii="Arial" w:cs="Arial" w:eastAsia="Arial" w:hAnsi="Arial"/>
-                <w:color w:val="1a1a2e"/>
-                <w:sz w:val="20"/>
-                <w:szCs w:val="20"/>
-                <w:rtl w:val="0"/>
-              </w:rPr>
-              <w:t xml:space="preserve">Sistema de Pagos</w:t>
-            </w:r>
-            <w:r>
-              <w:rPr>
-                <w:rtl w:val="0"/>
-              </w:rPr>
-            </w:r>
-          </w:p>
-        </w:tc>
-        <w:tc>
-          <w:tcPr>
-            <w:tcBorders>
-              <w:top w:color="bdc3c7" w:space="0" w:sz="4" w:val="single"/>
-              <w:left w:color="bdc3c7" w:space="0" w:sz="4" w:val="single"/>
-              <w:bottom w:color="bdc3c7" w:space="0" w:sz="4" w:val="single"/>
-              <w:right w:color="bdc3c7" w:space="0" w:sz="4" w:val="single"/>
-            </w:tcBorders>
-            <w:shd w:fill="f5f7fa" w:val="clear"/>
-            <w:tcMar>
-              <w:top w:w="80.0" w:type="dxa"/>
-              <w:left w:w="140.0" w:type="dxa"/>
-              <w:bottom w:w="80.0" w:type="dxa"/>
-              <w:right w:w="140.0" w:type="dxa"/>
-            </w:tcMar>
-          </w:tcPr>
-          <w:p>
-            <w:pPr>
-              <w:rPr/>
-            </w:pPr>
-            <w:r>
-              <w:rPr>
-                <w:rFonts w:ascii="Arial" w:cs="Arial" w:eastAsia="Arial" w:hAnsi="Arial"/>
-                <w:color w:val="1a1a2e"/>
+            <w:shd w:fill="707a7c" w:val="clear"/>
+            <w:tcMar>
+              <w:top w:w="80.0" w:type="dxa"/>
+              <w:left w:w="140.0" w:type="dxa"/>
+              <w:bottom w:w="80.0" w:type="dxa"/>
+              <w:right w:w="140.0" w:type="dxa"/>
+            </w:tcMar>
+          </w:tcPr>
+          <w:p>
+            <w:pPr>
+              <w:rPr>
+                <w:color w:val="ffffff"/>
+                <w:sz w:val="20"/>
+                <w:szCs w:val="20"/>
+              </w:rPr>
+            </w:pPr>
+            <w:r>
+              <w:rPr>
+                <w:color w:val="ffffff"/>
+                <w:sz w:val="20"/>
+                <w:szCs w:val="20"/>
+                <w:rtl w:val="0"/>
+              </w:rPr>
+              <w:t xml:space="preserve">Motor de Ejecución</w:t>
+            </w:r>
+          </w:p>
+        </w:tc>
+        <w:tc>
+          <w:tcPr>
+            <w:tcBorders>
+              <w:top w:color="bdc3c7" w:space="0" w:sz="4" w:val="single"/>
+              <w:left w:color="bdc3c7" w:space="0" w:sz="4" w:val="single"/>
+              <w:bottom w:color="bdc3c7" w:space="0" w:sz="4" w:val="single"/>
+              <w:right w:color="bdc3c7" w:space="0" w:sz="4" w:val="single"/>
+            </w:tcBorders>
+            <w:shd w:fill="707a7c" w:val="clear"/>
+            <w:tcMar>
+              <w:top w:w="80.0" w:type="dxa"/>
+              <w:left w:w="140.0" w:type="dxa"/>
+              <w:bottom w:w="80.0" w:type="dxa"/>
+              <w:right w:w="140.0" w:type="dxa"/>
+            </w:tcMar>
+          </w:tcPr>
+          <w:p>
+            <w:pPr>
+              <w:rPr>
+                <w:color w:val="ffffff"/>
+              </w:rPr>
+            </w:pPr>
+            <w:r>
+              <w:rPr>
+                <w:rFonts w:ascii="Arial" w:cs="Arial" w:eastAsia="Arial" w:hAnsi="Arial"/>
+                <w:color w:val="ffffff"/>
                 <w:sz w:val="20"/>
                 <w:szCs w:val="20"/>
                 <w:rtl w:val="0"/>
@@ -4504,32 +4527,30 @@
               <w:bottom w:color="bdc3c7" w:space="0" w:sz="4" w:val="single"/>
               <w:right w:color="bdc3c7" w:space="0" w:sz="4" w:val="single"/>
             </w:tcBorders>
-            <w:shd w:fill="f5f7fa" w:val="clear"/>
-            <w:tcMar>
-              <w:top w:w="80.0" w:type="dxa"/>
-              <w:left w:w="140.0" w:type="dxa"/>
-              <w:bottom w:w="80.0" w:type="dxa"/>
-              <w:right w:w="140.0" w:type="dxa"/>
-            </w:tcMar>
-          </w:tcPr>
-          <w:p>
-            <w:pPr>
-              <w:rPr/>
-            </w:pPr>
-            <w:r>
-              <w:rPr>
-                <w:rFonts w:ascii="Arial" w:cs="Arial" w:eastAsia="Arial" w:hAnsi="Arial"/>
-                <w:color w:val="1a1a2e"/>
-                <w:sz w:val="20"/>
-                <w:szCs w:val="20"/>
-                <w:rtl w:val="0"/>
-              </w:rPr>
-              <w:t xml:space="preserve">Procesa pagos de suscripciones (ej. Stripe, PayPal)</w:t>
-            </w:r>
-            <w:r>
-              <w:rPr>
-                <w:rtl w:val="0"/>
-              </w:rPr>
+            <w:shd w:fill="707a7c" w:val="clear"/>
+            <w:tcMar>
+              <w:top w:w="80.0" w:type="dxa"/>
+              <w:left w:w="140.0" w:type="dxa"/>
+              <w:bottom w:w="80.0" w:type="dxa"/>
+              <w:right w:w="140.0" w:type="dxa"/>
+            </w:tcMar>
+          </w:tcPr>
+          <w:p>
+            <w:pPr>
+              <w:rPr>
+                <w:color w:val="ffffff"/>
+                <w:sz w:val="20"/>
+                <w:szCs w:val="20"/>
+              </w:rPr>
+            </w:pPr>
+            <w:r>
+              <w:rPr>
+                <w:color w:val="ffffff"/>
+                <w:sz w:val="20"/>
+                <w:szCs w:val="20"/>
+                <w:rtl w:val="0"/>
+              </w:rPr>
+              <w:t xml:space="preserve">Entorno aislado (Sandbox) que ejecuta el código de forma segura.</w:t>
             </w:r>
           </w:p>
         </w:tc>
@@ -4547,59 +4568,59 @@
               <w:bottom w:color="bdc3c7" w:space="0" w:sz="4" w:val="single"/>
               <w:right w:color="bdc3c7" w:space="0" w:sz="4" w:val="single"/>
             </w:tcBorders>
-            <w:shd w:fill="ffffff" w:val="clear"/>
-            <w:tcMar>
-              <w:top w:w="80.0" w:type="dxa"/>
-              <w:left w:w="140.0" w:type="dxa"/>
-              <w:bottom w:w="80.0" w:type="dxa"/>
-              <w:right w:w="140.0" w:type="dxa"/>
-            </w:tcMar>
-          </w:tcPr>
-          <w:p>
-            <w:pPr>
-              <w:rPr/>
-            </w:pPr>
-            <w:r>
-              <w:rPr>
-                <w:rFonts w:ascii="Arial" w:cs="Arial" w:eastAsia="Arial" w:hAnsi="Arial"/>
-                <w:color w:val="1a1a2e"/>
-                <w:sz w:val="20"/>
-                <w:szCs w:val="20"/>
-                <w:rtl w:val="0"/>
-              </w:rPr>
-              <w:t xml:space="preserve">Servicio de Email</w:t>
-            </w:r>
-            <w:r>
-              <w:rPr>
-                <w:rtl w:val="0"/>
-              </w:rPr>
-            </w:r>
-          </w:p>
-        </w:tc>
-        <w:tc>
-          <w:tcPr>
-            <w:tcBorders>
-              <w:top w:color="bdc3c7" w:space="0" w:sz="4" w:val="single"/>
-              <w:left w:color="bdc3c7" w:space="0" w:sz="4" w:val="single"/>
-              <w:bottom w:color="bdc3c7" w:space="0" w:sz="4" w:val="single"/>
-              <w:right w:color="bdc3c7" w:space="0" w:sz="4" w:val="single"/>
-            </w:tcBorders>
-            <w:shd w:fill="ffffff" w:val="clear"/>
-            <w:tcMar>
-              <w:top w:w="80.0" w:type="dxa"/>
-              <w:left w:w="140.0" w:type="dxa"/>
-              <w:bottom w:w="80.0" w:type="dxa"/>
-              <w:right w:w="140.0" w:type="dxa"/>
-            </w:tcMar>
-          </w:tcPr>
-          <w:p>
-            <w:pPr>
-              <w:rPr/>
-            </w:pPr>
-            <w:r>
-              <w:rPr>
-                <w:rFonts w:ascii="Arial" w:cs="Arial" w:eastAsia="Arial" w:hAnsi="Arial"/>
-                <w:color w:val="1a1a2e"/>
+            <w:shd w:fill="707a7c" w:val="clear"/>
+            <w:tcMar>
+              <w:top w:w="80.0" w:type="dxa"/>
+              <w:left w:w="140.0" w:type="dxa"/>
+              <w:bottom w:w="80.0" w:type="dxa"/>
+              <w:right w:w="140.0" w:type="dxa"/>
+            </w:tcMar>
+          </w:tcPr>
+          <w:p>
+            <w:pPr>
+              <w:rPr>
+                <w:color w:val="ffffff"/>
+                <w:sz w:val="20"/>
+                <w:szCs w:val="20"/>
+              </w:rPr>
+            </w:pPr>
+            <w:r>
+              <w:rPr>
+                <w:color w:val="ffffff"/>
+                <w:sz w:val="20"/>
+                <w:szCs w:val="20"/>
+                <w:rtl w:val="0"/>
+              </w:rPr>
+              <w:t xml:space="preserve">Supabase</w:t>
+            </w:r>
+          </w:p>
+        </w:tc>
+        <w:tc>
+          <w:tcPr>
+            <w:tcBorders>
+              <w:top w:color="bdc3c7" w:space="0" w:sz="4" w:val="single"/>
+              <w:left w:color="bdc3c7" w:space="0" w:sz="4" w:val="single"/>
+              <w:bottom w:color="bdc3c7" w:space="0" w:sz="4" w:val="single"/>
+              <w:right w:color="bdc3c7" w:space="0" w:sz="4" w:val="single"/>
+            </w:tcBorders>
+            <w:shd w:fill="707a7c" w:val="clear"/>
+            <w:tcMar>
+              <w:top w:w="80.0" w:type="dxa"/>
+              <w:left w:w="140.0" w:type="dxa"/>
+              <w:bottom w:w="80.0" w:type="dxa"/>
+              <w:right w:w="140.0" w:type="dxa"/>
+            </w:tcMar>
+          </w:tcPr>
+          <w:p>
+            <w:pPr>
+              <w:rPr>
+                <w:color w:val="ffffff"/>
+              </w:rPr>
+            </w:pPr>
+            <w:r>
+              <w:rPr>
+                <w:rFonts w:ascii="Arial" w:cs="Arial" w:eastAsia="Arial" w:hAnsi="Arial"/>
+                <w:color w:val="ffffff"/>
                 <w:sz w:val="20"/>
                 <w:szCs w:val="20"/>
                 <w:rtl w:val="0"/>
@@ -4621,32 +4642,30 @@
               <w:bottom w:color="bdc3c7" w:space="0" w:sz="4" w:val="single"/>
               <w:right w:color="bdc3c7" w:space="0" w:sz="4" w:val="single"/>
             </w:tcBorders>
-            <w:shd w:fill="ffffff" w:val="clear"/>
-            <w:tcMar>
-              <w:top w:w="80.0" w:type="dxa"/>
-              <w:left w:w="140.0" w:type="dxa"/>
-              <w:bottom w:w="80.0" w:type="dxa"/>
-              <w:right w:w="140.0" w:type="dxa"/>
-            </w:tcMar>
-          </w:tcPr>
-          <w:p>
-            <w:pPr>
-              <w:rPr/>
-            </w:pPr>
-            <w:r>
-              <w:rPr>
-                <w:rFonts w:ascii="Arial" w:cs="Arial" w:eastAsia="Arial" w:hAnsi="Arial"/>
-                <w:color w:val="1a1a2e"/>
-                <w:sz w:val="20"/>
-                <w:szCs w:val="20"/>
-                <w:rtl w:val="0"/>
-              </w:rPr>
-              <w:t xml:space="preserve">Envío de notificaciones y confirmaciones</w:t>
-            </w:r>
-            <w:r>
-              <w:rPr>
-                <w:rtl w:val="0"/>
-              </w:rPr>
+            <w:shd w:fill="707a7c" w:val="clear"/>
+            <w:tcMar>
+              <w:top w:w="80.0" w:type="dxa"/>
+              <w:left w:w="140.0" w:type="dxa"/>
+              <w:bottom w:w="80.0" w:type="dxa"/>
+              <w:right w:w="140.0" w:type="dxa"/>
+            </w:tcMar>
+          </w:tcPr>
+          <w:p>
+            <w:pPr>
+              <w:rPr>
+                <w:color w:val="ffffff"/>
+                <w:sz w:val="20"/>
+                <w:szCs w:val="20"/>
+              </w:rPr>
+            </w:pPr>
+            <w:r>
+              <w:rPr>
+                <w:color w:val="ffffff"/>
+                <w:sz w:val="20"/>
+                <w:szCs w:val="20"/>
+                <w:rtl w:val="0"/>
+              </w:rPr>
+              <w:t xml:space="preserve">Provee la base de datos PostgreSQL, gestión de identidad (Auth JWT) y políticas de seguridad (RLS).</w:t>
             </w:r>
           </w:p>
         </w:tc>
@@ -4654,22 +4673,8 @@
     </w:tbl>
     <w:p>
       <w:pPr>
-        <w:spacing w:after="0" w:before="120" w:lineRule="auto"/>
         <w:rPr/>
       </w:pPr>
-      <w:r>
-        <w:rPr>
-          <w:rtl w:val="0"/>
-        </w:rPr>
-      </w:r>
-    </w:p>
-    <w:p>
-      <w:pPr>
-        <w:rPr/>
-      </w:pPr>
-      <w:r>
-        <w:br w:type="page"/>
-      </w:r>
       <w:r>
         <w:rPr>
           <w:rtl w:val="0"/>
@@ -4732,7 +4737,7 @@
           <wp:inline distB="114300" distT="114300" distL="114300" distR="114300">
             <wp:extent cx="5943600" cy="3898900"/>
             <wp:effectExtent b="0" l="0" r="0" t="0"/>
-            <wp:docPr id="2" name="image1.png"/>
+            <wp:docPr id="3" name="image1.png"/>
             <a:graphic>
               <a:graphicData uri="http://schemas.openxmlformats.org/drawingml/2006/picture">
                 <pic:pic>
@@ -4969,106 +4974,100 @@
               <w:bottom w:color="bdc3c7" w:space="0" w:sz="4" w:val="single"/>
               <w:right w:color="bdc3c7" w:space="0" w:sz="4" w:val="single"/>
             </w:tcBorders>
-            <w:shd w:fill="ffffff" w:val="clear"/>
-            <w:tcMar>
-              <w:top w:w="80.0" w:type="dxa"/>
-              <w:left w:w="140.0" w:type="dxa"/>
-              <w:bottom w:w="80.0" w:type="dxa"/>
-              <w:right w:w="140.0" w:type="dxa"/>
-            </w:tcMar>
-          </w:tcPr>
-          <w:p>
-            <w:pPr>
-              <w:rPr/>
-            </w:pPr>
-            <w:r>
-              <w:rPr>
-                <w:rFonts w:ascii="Arial" w:cs="Arial" w:eastAsia="Arial" w:hAnsi="Arial"/>
-                <w:color w:val="1a1a2e"/>
-                <w:sz w:val="20"/>
-                <w:szCs w:val="20"/>
-                <w:rtl w:val="0"/>
-              </w:rPr>
-              <w:t xml:space="preserve">Frontend Web</w:t>
-            </w:r>
-            <w:r>
-              <w:rPr>
-                <w:rtl w:val="0"/>
-              </w:rPr>
-            </w:r>
-          </w:p>
-        </w:tc>
-        <w:tc>
-          <w:tcPr>
-            <w:tcBorders>
-              <w:top w:color="bdc3c7" w:space="0" w:sz="4" w:val="single"/>
-              <w:left w:color="bdc3c7" w:space="0" w:sz="4" w:val="single"/>
-              <w:bottom w:color="bdc3c7" w:space="0" w:sz="4" w:val="single"/>
-              <w:right w:color="bdc3c7" w:space="0" w:sz="4" w:val="single"/>
-            </w:tcBorders>
-            <w:shd w:fill="ffffff" w:val="clear"/>
-            <w:tcMar>
-              <w:top w:w="80.0" w:type="dxa"/>
-              <w:left w:w="140.0" w:type="dxa"/>
-              <w:bottom w:w="80.0" w:type="dxa"/>
-              <w:right w:w="140.0" w:type="dxa"/>
-            </w:tcMar>
-          </w:tcPr>
-          <w:p>
-            <w:pPr>
-              <w:rPr/>
-            </w:pPr>
-            <w:r>
-              <w:rPr>
-                <w:rFonts w:ascii="Arial" w:cs="Arial" w:eastAsia="Arial" w:hAnsi="Arial"/>
-                <w:color w:val="1a1a2e"/>
-                <w:sz w:val="20"/>
-                <w:szCs w:val="20"/>
-                <w:rtl w:val="0"/>
-              </w:rPr>
-              <w:t xml:space="preserve">Aplicación Web (ej. React/Vue)</w:t>
-            </w:r>
-            <w:r>
-              <w:rPr>
-                <w:rtl w:val="0"/>
-              </w:rPr>
-            </w:r>
-          </w:p>
-        </w:tc>
-        <w:tc>
-          <w:tcPr>
-            <w:tcBorders>
-              <w:top w:color="bdc3c7" w:space="0" w:sz="4" w:val="single"/>
-              <w:left w:color="bdc3c7" w:space="0" w:sz="4" w:val="single"/>
-              <w:bottom w:color="bdc3c7" w:space="0" w:sz="4" w:val="single"/>
-              <w:right w:color="bdc3c7" w:space="0" w:sz="4" w:val="single"/>
-            </w:tcBorders>
-            <w:shd w:fill="ffffff" w:val="clear"/>
-            <w:tcMar>
-              <w:top w:w="80.0" w:type="dxa"/>
-              <w:left w:w="140.0" w:type="dxa"/>
-              <w:bottom w:w="80.0" w:type="dxa"/>
-              <w:right w:w="140.0" w:type="dxa"/>
-            </w:tcMar>
-          </w:tcPr>
-          <w:p>
-            <w:pPr>
-              <w:rPr/>
-            </w:pPr>
-            <w:r>
-              <w:rPr>
-                <w:rFonts w:ascii="Arial" w:cs="Arial" w:eastAsia="Arial" w:hAnsi="Arial"/>
-                <w:color w:val="1a1a2e"/>
-                <w:sz w:val="20"/>
-                <w:szCs w:val="20"/>
-                <w:rtl w:val="0"/>
-              </w:rPr>
-              <w:t xml:space="preserve">Interfaz de usuario accesible desde el navegador</w:t>
-            </w:r>
-            <w:r>
-              <w:rPr>
-                <w:rtl w:val="0"/>
-              </w:rPr>
+            <w:shd w:fill="08427b" w:val="clear"/>
+            <w:tcMar>
+              <w:top w:w="80.0" w:type="dxa"/>
+              <w:left w:w="140.0" w:type="dxa"/>
+              <w:bottom w:w="80.0" w:type="dxa"/>
+              <w:right w:w="140.0" w:type="dxa"/>
+            </w:tcMar>
+          </w:tcPr>
+          <w:p>
+            <w:pPr>
+              <w:rPr>
+                <w:color w:val="ffffff"/>
+                <w:sz w:val="20"/>
+                <w:szCs w:val="20"/>
+              </w:rPr>
+            </w:pPr>
+            <w:r>
+              <w:rPr>
+                <w:color w:val="ffffff"/>
+                <w:sz w:val="20"/>
+                <w:szCs w:val="20"/>
+                <w:rtl w:val="0"/>
+              </w:rPr>
+              <w:t xml:space="preserve">Administrador</w:t>
+            </w:r>
+          </w:p>
+        </w:tc>
+        <w:tc>
+          <w:tcPr>
+            <w:tcBorders>
+              <w:top w:color="bdc3c7" w:space="0" w:sz="4" w:val="single"/>
+              <w:left w:color="bdc3c7" w:space="0" w:sz="4" w:val="single"/>
+              <w:bottom w:color="bdc3c7" w:space="0" w:sz="4" w:val="single"/>
+              <w:right w:color="bdc3c7" w:space="0" w:sz="4" w:val="single"/>
+            </w:tcBorders>
+            <w:shd w:fill="08427b" w:val="clear"/>
+            <w:tcMar>
+              <w:top w:w="80.0" w:type="dxa"/>
+              <w:left w:w="140.0" w:type="dxa"/>
+              <w:bottom w:w="80.0" w:type="dxa"/>
+              <w:right w:w="140.0" w:type="dxa"/>
+            </w:tcMar>
+          </w:tcPr>
+          <w:p>
+            <w:pPr>
+              <w:rPr>
+                <w:color w:val="ffffff"/>
+                <w:sz w:val="20"/>
+                <w:szCs w:val="20"/>
+              </w:rPr>
+            </w:pPr>
+            <w:r>
+              <w:rPr>
+                <w:color w:val="ffffff"/>
+                <w:sz w:val="20"/>
+                <w:szCs w:val="20"/>
+                <w:rtl w:val="0"/>
+              </w:rPr>
+              <w:t xml:space="preserve">Persona</w:t>
+            </w:r>
+          </w:p>
+        </w:tc>
+        <w:tc>
+          <w:tcPr>
+            <w:tcBorders>
+              <w:top w:color="bdc3c7" w:space="0" w:sz="4" w:val="single"/>
+              <w:left w:color="bdc3c7" w:space="0" w:sz="4" w:val="single"/>
+              <w:bottom w:color="bdc3c7" w:space="0" w:sz="4" w:val="single"/>
+              <w:right w:color="bdc3c7" w:space="0" w:sz="4" w:val="single"/>
+            </w:tcBorders>
+            <w:shd w:fill="08427b" w:val="clear"/>
+            <w:tcMar>
+              <w:top w:w="80.0" w:type="dxa"/>
+              <w:left w:w="140.0" w:type="dxa"/>
+              <w:bottom w:w="80.0" w:type="dxa"/>
+              <w:right w:w="140.0" w:type="dxa"/>
+            </w:tcMar>
+          </w:tcPr>
+          <w:p>
+            <w:pPr>
+              <w:rPr>
+                <w:color w:val="ffffff"/>
+                <w:sz w:val="20"/>
+                <w:szCs w:val="20"/>
+              </w:rPr>
+            </w:pPr>
+            <w:r>
+              <w:rPr>
+                <w:color w:val="ffffff"/>
+                <w:sz w:val="20"/>
+                <w:szCs w:val="20"/>
+                <w:rtl w:val="0"/>
+              </w:rPr>
+              <w:t xml:space="preserve">Gestiona problemas y casos de pruebas</w:t>
             </w:r>
           </w:p>
         </w:tc>
@@ -5086,106 +5085,100 @@
               <w:bottom w:color="bdc3c7" w:space="0" w:sz="4" w:val="single"/>
               <w:right w:color="bdc3c7" w:space="0" w:sz="4" w:val="single"/>
             </w:tcBorders>
-            <w:shd w:fill="f5f7fa" w:val="clear"/>
-            <w:tcMar>
-              <w:top w:w="80.0" w:type="dxa"/>
-              <w:left w:w="140.0" w:type="dxa"/>
-              <w:bottom w:w="80.0" w:type="dxa"/>
-              <w:right w:w="140.0" w:type="dxa"/>
-            </w:tcMar>
-          </w:tcPr>
-          <w:p>
-            <w:pPr>
-              <w:rPr/>
-            </w:pPr>
-            <w:r>
-              <w:rPr>
-                <w:rFonts w:ascii="Arial" w:cs="Arial" w:eastAsia="Arial" w:hAnsi="Arial"/>
-                <w:color w:val="1a1a2e"/>
-                <w:sz w:val="20"/>
-                <w:szCs w:val="20"/>
-                <w:rtl w:val="0"/>
-              </w:rPr>
-              <w:t xml:space="preserve">Backend API</w:t>
-            </w:r>
-            <w:r>
-              <w:rPr>
-                <w:rtl w:val="0"/>
-              </w:rPr>
-            </w:r>
-          </w:p>
-        </w:tc>
-        <w:tc>
-          <w:tcPr>
-            <w:tcBorders>
-              <w:top w:color="bdc3c7" w:space="0" w:sz="4" w:val="single"/>
-              <w:left w:color="bdc3c7" w:space="0" w:sz="4" w:val="single"/>
-              <w:bottom w:color="bdc3c7" w:space="0" w:sz="4" w:val="single"/>
-              <w:right w:color="bdc3c7" w:space="0" w:sz="4" w:val="single"/>
-            </w:tcBorders>
-            <w:shd w:fill="f5f7fa" w:val="clear"/>
-            <w:tcMar>
-              <w:top w:w="80.0" w:type="dxa"/>
-              <w:left w:w="140.0" w:type="dxa"/>
-              <w:bottom w:w="80.0" w:type="dxa"/>
-              <w:right w:w="140.0" w:type="dxa"/>
-            </w:tcMar>
-          </w:tcPr>
-          <w:p>
-            <w:pPr>
-              <w:rPr/>
-            </w:pPr>
-            <w:r>
-              <w:rPr>
-                <w:rFonts w:ascii="Arial" w:cs="Arial" w:eastAsia="Arial" w:hAnsi="Arial"/>
-                <w:color w:val="1a1a2e"/>
-                <w:sz w:val="20"/>
-                <w:szCs w:val="20"/>
-                <w:rtl w:val="0"/>
-              </w:rPr>
-              <w:t xml:space="preserve">Aplicación Servidor (ej. Node.js/Django)</w:t>
-            </w:r>
-            <w:r>
-              <w:rPr>
-                <w:rtl w:val="0"/>
-              </w:rPr>
-            </w:r>
-          </w:p>
-        </w:tc>
-        <w:tc>
-          <w:tcPr>
-            <w:tcBorders>
-              <w:top w:color="bdc3c7" w:space="0" w:sz="4" w:val="single"/>
-              <w:left w:color="bdc3c7" w:space="0" w:sz="4" w:val="single"/>
-              <w:bottom w:color="bdc3c7" w:space="0" w:sz="4" w:val="single"/>
-              <w:right w:color="bdc3c7" w:space="0" w:sz="4" w:val="single"/>
-            </w:tcBorders>
-            <w:shd w:fill="f5f7fa" w:val="clear"/>
-            <w:tcMar>
-              <w:top w:w="80.0" w:type="dxa"/>
-              <w:left w:w="140.0" w:type="dxa"/>
-              <w:bottom w:w="80.0" w:type="dxa"/>
-              <w:right w:w="140.0" w:type="dxa"/>
-            </w:tcMar>
-          </w:tcPr>
-          <w:p>
-            <w:pPr>
-              <w:rPr/>
-            </w:pPr>
-            <w:r>
-              <w:rPr>
-                <w:rFonts w:ascii="Arial" w:cs="Arial" w:eastAsia="Arial" w:hAnsi="Arial"/>
-                <w:color w:val="1a1a2e"/>
-                <w:sz w:val="20"/>
-                <w:szCs w:val="20"/>
-                <w:rtl w:val="0"/>
-              </w:rPr>
-              <w:t xml:space="preserve">Lógica de negocio y exposición de APIs REST/GraphQL</w:t>
-            </w:r>
-            <w:r>
-              <w:rPr>
-                <w:rtl w:val="0"/>
-              </w:rPr>
+            <w:shd w:fill="08427b" w:val="clear"/>
+            <w:tcMar>
+              <w:top w:w="80.0" w:type="dxa"/>
+              <w:left w:w="140.0" w:type="dxa"/>
+              <w:bottom w:w="80.0" w:type="dxa"/>
+              <w:right w:w="140.0" w:type="dxa"/>
+            </w:tcMar>
+          </w:tcPr>
+          <w:p>
+            <w:pPr>
+              <w:rPr>
+                <w:color w:val="ffffff"/>
+                <w:sz w:val="20"/>
+                <w:szCs w:val="20"/>
+              </w:rPr>
+            </w:pPr>
+            <w:r>
+              <w:rPr>
+                <w:color w:val="ffffff"/>
+                <w:sz w:val="20"/>
+                <w:szCs w:val="20"/>
+                <w:rtl w:val="0"/>
+              </w:rPr>
+              <w:t xml:space="preserve">Estudiante</w:t>
+            </w:r>
+          </w:p>
+        </w:tc>
+        <w:tc>
+          <w:tcPr>
+            <w:tcBorders>
+              <w:top w:color="bdc3c7" w:space="0" w:sz="4" w:val="single"/>
+              <w:left w:color="bdc3c7" w:space="0" w:sz="4" w:val="single"/>
+              <w:bottom w:color="bdc3c7" w:space="0" w:sz="4" w:val="single"/>
+              <w:right w:color="bdc3c7" w:space="0" w:sz="4" w:val="single"/>
+            </w:tcBorders>
+            <w:shd w:fill="08427b" w:val="clear"/>
+            <w:tcMar>
+              <w:top w:w="80.0" w:type="dxa"/>
+              <w:left w:w="140.0" w:type="dxa"/>
+              <w:bottom w:w="80.0" w:type="dxa"/>
+              <w:right w:w="140.0" w:type="dxa"/>
+            </w:tcMar>
+          </w:tcPr>
+          <w:p>
+            <w:pPr>
+              <w:rPr>
+                <w:color w:val="ffffff"/>
+                <w:sz w:val="20"/>
+                <w:szCs w:val="20"/>
+              </w:rPr>
+            </w:pPr>
+            <w:r>
+              <w:rPr>
+                <w:color w:val="ffffff"/>
+                <w:sz w:val="20"/>
+                <w:szCs w:val="20"/>
+                <w:rtl w:val="0"/>
+              </w:rPr>
+              <w:t xml:space="preserve">Persona</w:t>
+            </w:r>
+          </w:p>
+        </w:tc>
+        <w:tc>
+          <w:tcPr>
+            <w:tcBorders>
+              <w:top w:color="bdc3c7" w:space="0" w:sz="4" w:val="single"/>
+              <w:left w:color="bdc3c7" w:space="0" w:sz="4" w:val="single"/>
+              <w:bottom w:color="bdc3c7" w:space="0" w:sz="4" w:val="single"/>
+              <w:right w:color="bdc3c7" w:space="0" w:sz="4" w:val="single"/>
+            </w:tcBorders>
+            <w:shd w:fill="08427b" w:val="clear"/>
+            <w:tcMar>
+              <w:top w:w="80.0" w:type="dxa"/>
+              <w:left w:w="140.0" w:type="dxa"/>
+              <w:bottom w:w="80.0" w:type="dxa"/>
+              <w:right w:w="140.0" w:type="dxa"/>
+            </w:tcMar>
+          </w:tcPr>
+          <w:p>
+            <w:pPr>
+              <w:rPr>
+                <w:color w:val="ffffff"/>
+                <w:sz w:val="20"/>
+                <w:szCs w:val="20"/>
+              </w:rPr>
+            </w:pPr>
+            <w:r>
+              <w:rPr>
+                <w:color w:val="ffffff"/>
+                <w:sz w:val="20"/>
+                <w:szCs w:val="20"/>
+                <w:rtl w:val="0"/>
+              </w:rPr>
+              <w:t xml:space="preserve">Usuario que resuelve retos</w:t>
             </w:r>
           </w:p>
         </w:tc>
@@ -5203,106 +5196,100 @@
               <w:bottom w:color="bdc3c7" w:space="0" w:sz="4" w:val="single"/>
               <w:right w:color="bdc3c7" w:space="0" w:sz="4" w:val="single"/>
             </w:tcBorders>
-            <w:shd w:fill="ffffff" w:val="clear"/>
-            <w:tcMar>
-              <w:top w:w="80.0" w:type="dxa"/>
-              <w:left w:w="140.0" w:type="dxa"/>
-              <w:bottom w:w="80.0" w:type="dxa"/>
-              <w:right w:w="140.0" w:type="dxa"/>
-            </w:tcMar>
-          </w:tcPr>
-          <w:p>
-            <w:pPr>
-              <w:rPr/>
-            </w:pPr>
-            <w:r>
-              <w:rPr>
-                <w:rFonts w:ascii="Arial" w:cs="Arial" w:eastAsia="Arial" w:hAnsi="Arial"/>
-                <w:color w:val="1a1a2e"/>
-                <w:sz w:val="20"/>
-                <w:szCs w:val="20"/>
-                <w:rtl w:val="0"/>
-              </w:rPr>
-              <w:t xml:space="preserve">Base de Datos</w:t>
-            </w:r>
-            <w:r>
-              <w:rPr>
-                <w:rtl w:val="0"/>
-              </w:rPr>
-            </w:r>
-          </w:p>
-        </w:tc>
-        <w:tc>
-          <w:tcPr>
-            <w:tcBorders>
-              <w:top w:color="bdc3c7" w:space="0" w:sz="4" w:val="single"/>
-              <w:left w:color="bdc3c7" w:space="0" w:sz="4" w:val="single"/>
-              <w:bottom w:color="bdc3c7" w:space="0" w:sz="4" w:val="single"/>
-              <w:right w:color="bdc3c7" w:space="0" w:sz="4" w:val="single"/>
-            </w:tcBorders>
-            <w:shd w:fill="ffffff" w:val="clear"/>
-            <w:tcMar>
-              <w:top w:w="80.0" w:type="dxa"/>
-              <w:left w:w="140.0" w:type="dxa"/>
-              <w:bottom w:w="80.0" w:type="dxa"/>
-              <w:right w:w="140.0" w:type="dxa"/>
-            </w:tcMar>
-          </w:tcPr>
-          <w:p>
-            <w:pPr>
-              <w:rPr/>
-            </w:pPr>
-            <w:r>
-              <w:rPr>
-                <w:rFonts w:ascii="Arial" w:cs="Arial" w:eastAsia="Arial" w:hAnsi="Arial"/>
-                <w:color w:val="1a1a2e"/>
-                <w:sz w:val="20"/>
-                <w:szCs w:val="20"/>
-                <w:rtl w:val="0"/>
-              </w:rPr>
-              <w:t xml:space="preserve">Almacén de Datos (ej. PostgreSQL)</w:t>
-            </w:r>
-            <w:r>
-              <w:rPr>
-                <w:rtl w:val="0"/>
-              </w:rPr>
-            </w:r>
-          </w:p>
-        </w:tc>
-        <w:tc>
-          <w:tcPr>
-            <w:tcBorders>
-              <w:top w:color="bdc3c7" w:space="0" w:sz="4" w:val="single"/>
-              <w:left w:color="bdc3c7" w:space="0" w:sz="4" w:val="single"/>
-              <w:bottom w:color="bdc3c7" w:space="0" w:sz="4" w:val="single"/>
-              <w:right w:color="bdc3c7" w:space="0" w:sz="4" w:val="single"/>
-            </w:tcBorders>
-            <w:shd w:fill="ffffff" w:val="clear"/>
-            <w:tcMar>
-              <w:top w:w="80.0" w:type="dxa"/>
-              <w:left w:w="140.0" w:type="dxa"/>
-              <w:bottom w:w="80.0" w:type="dxa"/>
-              <w:right w:w="140.0" w:type="dxa"/>
-            </w:tcMar>
-          </w:tcPr>
-          <w:p>
-            <w:pPr>
-              <w:rPr/>
-            </w:pPr>
-            <w:r>
-              <w:rPr>
-                <w:rFonts w:ascii="Arial" w:cs="Arial" w:eastAsia="Arial" w:hAnsi="Arial"/>
-                <w:color w:val="1a1a2e"/>
-                <w:sz w:val="20"/>
-                <w:szCs w:val="20"/>
-                <w:rtl w:val="0"/>
-              </w:rPr>
-              <w:t xml:space="preserve">Persistencia de usuarios, cursos y transacciones</w:t>
-            </w:r>
-            <w:r>
-              <w:rPr>
-                <w:rtl w:val="0"/>
-              </w:rPr>
+            <w:shd w:fill="438dd5" w:val="clear"/>
+            <w:tcMar>
+              <w:top w:w="80.0" w:type="dxa"/>
+              <w:left w:w="140.0" w:type="dxa"/>
+              <w:bottom w:w="80.0" w:type="dxa"/>
+              <w:right w:w="140.0" w:type="dxa"/>
+            </w:tcMar>
+          </w:tcPr>
+          <w:p>
+            <w:pPr>
+              <w:rPr>
+                <w:color w:val="ffffff"/>
+                <w:sz w:val="20"/>
+                <w:szCs w:val="20"/>
+              </w:rPr>
+            </w:pPr>
+            <w:r>
+              <w:rPr>
+                <w:color w:val="ffffff"/>
+                <w:sz w:val="20"/>
+                <w:szCs w:val="20"/>
+                <w:rtl w:val="0"/>
+              </w:rPr>
+              <w:t xml:space="preserve">Frontend web</w:t>
+            </w:r>
+          </w:p>
+        </w:tc>
+        <w:tc>
+          <w:tcPr>
+            <w:tcBorders>
+              <w:top w:color="bdc3c7" w:space="0" w:sz="4" w:val="single"/>
+              <w:left w:color="bdc3c7" w:space="0" w:sz="4" w:val="single"/>
+              <w:bottom w:color="bdc3c7" w:space="0" w:sz="4" w:val="single"/>
+              <w:right w:color="bdc3c7" w:space="0" w:sz="4" w:val="single"/>
+            </w:tcBorders>
+            <w:shd w:fill="438dd5" w:val="clear"/>
+            <w:tcMar>
+              <w:top w:w="80.0" w:type="dxa"/>
+              <w:left w:w="140.0" w:type="dxa"/>
+              <w:bottom w:w="80.0" w:type="dxa"/>
+              <w:right w:w="140.0" w:type="dxa"/>
+            </w:tcMar>
+          </w:tcPr>
+          <w:p>
+            <w:pPr>
+              <w:rPr>
+                <w:color w:val="ffffff"/>
+                <w:sz w:val="20"/>
+                <w:szCs w:val="20"/>
+              </w:rPr>
+            </w:pPr>
+            <w:r>
+              <w:rPr>
+                <w:color w:val="ffffff"/>
+                <w:sz w:val="20"/>
+                <w:szCs w:val="20"/>
+                <w:rtl w:val="0"/>
+              </w:rPr>
+              <w:t xml:space="preserve">Aplicación Web (React/Next js)</w:t>
+            </w:r>
+          </w:p>
+        </w:tc>
+        <w:tc>
+          <w:tcPr>
+            <w:tcBorders>
+              <w:top w:color="bdc3c7" w:space="0" w:sz="4" w:val="single"/>
+              <w:left w:color="bdc3c7" w:space="0" w:sz="4" w:val="single"/>
+              <w:bottom w:color="bdc3c7" w:space="0" w:sz="4" w:val="single"/>
+              <w:right w:color="bdc3c7" w:space="0" w:sz="4" w:val="single"/>
+            </w:tcBorders>
+            <w:shd w:fill="438dd5" w:val="clear"/>
+            <w:tcMar>
+              <w:top w:w="80.0" w:type="dxa"/>
+              <w:left w:w="140.0" w:type="dxa"/>
+              <w:bottom w:w="80.0" w:type="dxa"/>
+              <w:right w:w="140.0" w:type="dxa"/>
+            </w:tcMar>
+          </w:tcPr>
+          <w:p>
+            <w:pPr>
+              <w:rPr>
+                <w:color w:val="ffffff"/>
+                <w:sz w:val="20"/>
+                <w:szCs w:val="20"/>
+              </w:rPr>
+            </w:pPr>
+            <w:r>
+              <w:rPr>
+                <w:color w:val="ffffff"/>
+                <w:sz w:val="20"/>
+                <w:szCs w:val="20"/>
+                <w:rtl w:val="0"/>
+              </w:rPr>
+              <w:t xml:space="preserve">Interfaz de usuario accesible desde el navegador</w:t>
             </w:r>
           </w:p>
         </w:tc>
@@ -5320,106 +5307,100 @@
               <w:bottom w:color="bdc3c7" w:space="0" w:sz="4" w:val="single"/>
               <w:right w:color="bdc3c7" w:space="0" w:sz="4" w:val="single"/>
             </w:tcBorders>
-            <w:shd w:fill="f5f7fa" w:val="clear"/>
-            <w:tcMar>
-              <w:top w:w="80.0" w:type="dxa"/>
-              <w:left w:w="140.0" w:type="dxa"/>
-              <w:bottom w:w="80.0" w:type="dxa"/>
-              <w:right w:w="140.0" w:type="dxa"/>
-            </w:tcMar>
-          </w:tcPr>
-          <w:p>
-            <w:pPr>
-              <w:rPr/>
-            </w:pPr>
-            <w:r>
-              <w:rPr>
-                <w:rFonts w:ascii="Arial" w:cs="Arial" w:eastAsia="Arial" w:hAnsi="Arial"/>
-                <w:color w:val="1a1a2e"/>
-                <w:sz w:val="20"/>
-                <w:szCs w:val="20"/>
-                <w:rtl w:val="0"/>
-              </w:rPr>
-              <w:t xml:space="preserve">Almacenamiento Archivos</w:t>
-            </w:r>
-            <w:r>
-              <w:rPr>
-                <w:rtl w:val="0"/>
-              </w:rPr>
-            </w:r>
-          </w:p>
-        </w:tc>
-        <w:tc>
-          <w:tcPr>
-            <w:tcBorders>
-              <w:top w:color="bdc3c7" w:space="0" w:sz="4" w:val="single"/>
-              <w:left w:color="bdc3c7" w:space="0" w:sz="4" w:val="single"/>
-              <w:bottom w:color="bdc3c7" w:space="0" w:sz="4" w:val="single"/>
-              <w:right w:color="bdc3c7" w:space="0" w:sz="4" w:val="single"/>
-            </w:tcBorders>
-            <w:shd w:fill="f5f7fa" w:val="clear"/>
-            <w:tcMar>
-              <w:top w:w="80.0" w:type="dxa"/>
-              <w:left w:w="140.0" w:type="dxa"/>
-              <w:bottom w:w="80.0" w:type="dxa"/>
-              <w:right w:w="140.0" w:type="dxa"/>
-            </w:tcMar>
-          </w:tcPr>
-          <w:p>
-            <w:pPr>
-              <w:rPr/>
-            </w:pPr>
-            <w:r>
-              <w:rPr>
-                <w:rFonts w:ascii="Arial" w:cs="Arial" w:eastAsia="Arial" w:hAnsi="Arial"/>
-                <w:color w:val="1a1a2e"/>
-                <w:sz w:val="20"/>
-                <w:szCs w:val="20"/>
-                <w:rtl w:val="0"/>
-              </w:rPr>
-              <w:t xml:space="preserve">Blob Storage (ej. S3)</w:t>
-            </w:r>
-            <w:r>
-              <w:rPr>
-                <w:rtl w:val="0"/>
-              </w:rPr>
-            </w:r>
-          </w:p>
-        </w:tc>
-        <w:tc>
-          <w:tcPr>
-            <w:tcBorders>
-              <w:top w:color="bdc3c7" w:space="0" w:sz="4" w:val="single"/>
-              <w:left w:color="bdc3c7" w:space="0" w:sz="4" w:val="single"/>
-              <w:bottom w:color="bdc3c7" w:space="0" w:sz="4" w:val="single"/>
-              <w:right w:color="bdc3c7" w:space="0" w:sz="4" w:val="single"/>
-            </w:tcBorders>
-            <w:shd w:fill="f5f7fa" w:val="clear"/>
-            <w:tcMar>
-              <w:top w:w="80.0" w:type="dxa"/>
-              <w:left w:w="140.0" w:type="dxa"/>
-              <w:bottom w:w="80.0" w:type="dxa"/>
-              <w:right w:w="140.0" w:type="dxa"/>
-            </w:tcMar>
-          </w:tcPr>
-          <w:p>
-            <w:pPr>
-              <w:rPr/>
-            </w:pPr>
-            <w:r>
-              <w:rPr>
-                <w:rFonts w:ascii="Arial" w:cs="Arial" w:eastAsia="Arial" w:hAnsi="Arial"/>
-                <w:color w:val="1a1a2e"/>
-                <w:sz w:val="20"/>
-                <w:szCs w:val="20"/>
-                <w:rtl w:val="0"/>
-              </w:rPr>
-              <w:t xml:space="preserve">Almacena videos, documentos y recursos del curso</w:t>
-            </w:r>
-            <w:r>
-              <w:rPr>
-                <w:rtl w:val="0"/>
-              </w:rPr>
+            <w:shd w:fill="438dd5" w:val="clear"/>
+            <w:tcMar>
+              <w:top w:w="80.0" w:type="dxa"/>
+              <w:left w:w="140.0" w:type="dxa"/>
+              <w:bottom w:w="80.0" w:type="dxa"/>
+              <w:right w:w="140.0" w:type="dxa"/>
+            </w:tcMar>
+          </w:tcPr>
+          <w:p>
+            <w:pPr>
+              <w:rPr>
+                <w:color w:val="ffffff"/>
+                <w:sz w:val="20"/>
+                <w:szCs w:val="20"/>
+              </w:rPr>
+            </w:pPr>
+            <w:r>
+              <w:rPr>
+                <w:color w:val="ffffff"/>
+                <w:sz w:val="20"/>
+                <w:szCs w:val="20"/>
+                <w:rtl w:val="0"/>
+              </w:rPr>
+              <w:t xml:space="preserve">API Backend</w:t>
+            </w:r>
+          </w:p>
+        </w:tc>
+        <w:tc>
+          <w:tcPr>
+            <w:tcBorders>
+              <w:top w:color="bdc3c7" w:space="0" w:sz="4" w:val="single"/>
+              <w:left w:color="bdc3c7" w:space="0" w:sz="4" w:val="single"/>
+              <w:bottom w:color="bdc3c7" w:space="0" w:sz="4" w:val="single"/>
+              <w:right w:color="bdc3c7" w:space="0" w:sz="4" w:val="single"/>
+            </w:tcBorders>
+            <w:shd w:fill="438dd5" w:val="clear"/>
+            <w:tcMar>
+              <w:top w:w="80.0" w:type="dxa"/>
+              <w:left w:w="140.0" w:type="dxa"/>
+              <w:bottom w:w="80.0" w:type="dxa"/>
+              <w:right w:w="140.0" w:type="dxa"/>
+            </w:tcMar>
+          </w:tcPr>
+          <w:p>
+            <w:pPr>
+              <w:rPr>
+                <w:color w:val="ffffff"/>
+                <w:sz w:val="20"/>
+                <w:szCs w:val="20"/>
+              </w:rPr>
+            </w:pPr>
+            <w:r>
+              <w:rPr>
+                <w:color w:val="ffffff"/>
+                <w:sz w:val="20"/>
+                <w:szCs w:val="20"/>
+                <w:rtl w:val="0"/>
+              </w:rPr>
+              <w:t xml:space="preserve">Aplicación servidor (micro framework web Flask)</w:t>
+            </w:r>
+          </w:p>
+        </w:tc>
+        <w:tc>
+          <w:tcPr>
+            <w:tcBorders>
+              <w:top w:color="bdc3c7" w:space="0" w:sz="4" w:val="single"/>
+              <w:left w:color="bdc3c7" w:space="0" w:sz="4" w:val="single"/>
+              <w:bottom w:color="bdc3c7" w:space="0" w:sz="4" w:val="single"/>
+              <w:right w:color="bdc3c7" w:space="0" w:sz="4" w:val="single"/>
+            </w:tcBorders>
+            <w:shd w:fill="438dd5" w:val="clear"/>
+            <w:tcMar>
+              <w:top w:w="80.0" w:type="dxa"/>
+              <w:left w:w="140.0" w:type="dxa"/>
+              <w:bottom w:w="80.0" w:type="dxa"/>
+              <w:right w:w="140.0" w:type="dxa"/>
+            </w:tcMar>
+          </w:tcPr>
+          <w:p>
+            <w:pPr>
+              <w:rPr>
+                <w:color w:val="ffffff"/>
+                <w:sz w:val="20"/>
+                <w:szCs w:val="20"/>
+              </w:rPr>
+            </w:pPr>
+            <w:r>
+              <w:rPr>
+                <w:color w:val="ffffff"/>
+                <w:sz w:val="20"/>
+                <w:szCs w:val="20"/>
+                <w:rtl w:val="0"/>
+              </w:rPr>
+              <w:t xml:space="preserve">Recibe peticiones y encola tareas</w:t>
             </w:r>
           </w:p>
         </w:tc>
@@ -5437,106 +5418,544 @@
               <w:bottom w:color="bdc3c7" w:space="0" w:sz="4" w:val="single"/>
               <w:right w:color="bdc3c7" w:space="0" w:sz="4" w:val="single"/>
             </w:tcBorders>
-            <w:shd w:fill="ffffff" w:val="clear"/>
-            <w:tcMar>
-              <w:top w:w="80.0" w:type="dxa"/>
-              <w:left w:w="140.0" w:type="dxa"/>
-              <w:bottom w:w="80.0" w:type="dxa"/>
-              <w:right w:w="140.0" w:type="dxa"/>
-            </w:tcMar>
-          </w:tcPr>
-          <w:p>
-            <w:pPr>
-              <w:rPr/>
-            </w:pPr>
-            <w:r>
-              <w:rPr>
-                <w:rFonts w:ascii="Arial" w:cs="Arial" w:eastAsia="Arial" w:hAnsi="Arial"/>
-                <w:color w:val="1a1a2e"/>
-                <w:sz w:val="20"/>
-                <w:szCs w:val="20"/>
-                <w:rtl w:val="0"/>
-              </w:rPr>
-              <w:t xml:space="preserve">Servidor de Caché</w:t>
-            </w:r>
-            <w:r>
-              <w:rPr>
-                <w:rtl w:val="0"/>
-              </w:rPr>
-            </w:r>
-          </w:p>
-        </w:tc>
-        <w:tc>
-          <w:tcPr>
-            <w:tcBorders>
-              <w:top w:color="bdc3c7" w:space="0" w:sz="4" w:val="single"/>
-              <w:left w:color="bdc3c7" w:space="0" w:sz="4" w:val="single"/>
-              <w:bottom w:color="bdc3c7" w:space="0" w:sz="4" w:val="single"/>
-              <w:right w:color="bdc3c7" w:space="0" w:sz="4" w:val="single"/>
-            </w:tcBorders>
-            <w:shd w:fill="ffffff" w:val="clear"/>
-            <w:tcMar>
-              <w:top w:w="80.0" w:type="dxa"/>
-              <w:left w:w="140.0" w:type="dxa"/>
-              <w:bottom w:w="80.0" w:type="dxa"/>
-              <w:right w:w="140.0" w:type="dxa"/>
-            </w:tcMar>
-          </w:tcPr>
-          <w:p>
-            <w:pPr>
-              <w:rPr/>
-            </w:pPr>
-            <w:r>
-              <w:rPr>
-                <w:rFonts w:ascii="Arial" w:cs="Arial" w:eastAsia="Arial" w:hAnsi="Arial"/>
-                <w:color w:val="1a1a2e"/>
-                <w:sz w:val="20"/>
-                <w:szCs w:val="20"/>
-                <w:rtl w:val="0"/>
-              </w:rPr>
-              <w:t xml:space="preserve">Caché (ej. Redis)</w:t>
-            </w:r>
-            <w:r>
-              <w:rPr>
-                <w:rtl w:val="0"/>
-              </w:rPr>
-            </w:r>
-          </w:p>
-        </w:tc>
-        <w:tc>
-          <w:tcPr>
-            <w:tcBorders>
-              <w:top w:color="bdc3c7" w:space="0" w:sz="4" w:val="single"/>
-              <w:left w:color="bdc3c7" w:space="0" w:sz="4" w:val="single"/>
-              <w:bottom w:color="bdc3c7" w:space="0" w:sz="4" w:val="single"/>
-              <w:right w:color="bdc3c7" w:space="0" w:sz="4" w:val="single"/>
-            </w:tcBorders>
-            <w:shd w:fill="ffffff" w:val="clear"/>
-            <w:tcMar>
-              <w:top w:w="80.0" w:type="dxa"/>
-              <w:left w:w="140.0" w:type="dxa"/>
-              <w:bottom w:w="80.0" w:type="dxa"/>
-              <w:right w:w="140.0" w:type="dxa"/>
-            </w:tcMar>
-          </w:tcPr>
-          <w:p>
-            <w:pPr>
-              <w:rPr/>
-            </w:pPr>
-            <w:r>
-              <w:rPr>
-                <w:rFonts w:ascii="Arial" w:cs="Arial" w:eastAsia="Arial" w:hAnsi="Arial"/>
-                <w:color w:val="1a1a2e"/>
-                <w:sz w:val="20"/>
-                <w:szCs w:val="20"/>
-                <w:rtl w:val="0"/>
-              </w:rPr>
-              <w:t xml:space="preserve">Sesiones y datos de alta frecuencia de acceso</w:t>
-            </w:r>
-            <w:r>
-              <w:rPr>
-                <w:rtl w:val="0"/>
-              </w:rPr>
+            <w:shd w:fill="2496ed" w:val="clear"/>
+            <w:tcMar>
+              <w:top w:w="80.0" w:type="dxa"/>
+              <w:left w:w="140.0" w:type="dxa"/>
+              <w:bottom w:w="80.0" w:type="dxa"/>
+              <w:right w:w="140.0" w:type="dxa"/>
+            </w:tcMar>
+          </w:tcPr>
+          <w:p>
+            <w:pPr>
+              <w:rPr>
+                <w:color w:val="ffffff"/>
+                <w:sz w:val="20"/>
+                <w:szCs w:val="20"/>
+              </w:rPr>
+            </w:pPr>
+            <w:r>
+              <w:rPr>
+                <w:color w:val="ffffff"/>
+                <w:sz w:val="20"/>
+                <w:szCs w:val="20"/>
+                <w:rtl w:val="0"/>
+              </w:rPr>
+              <w:t xml:space="preserve">Servicio de Auth</w:t>
+            </w:r>
+          </w:p>
+        </w:tc>
+        <w:tc>
+          <w:tcPr>
+            <w:tcBorders>
+              <w:top w:color="bdc3c7" w:space="0" w:sz="4" w:val="single"/>
+              <w:left w:color="bdc3c7" w:space="0" w:sz="4" w:val="single"/>
+              <w:bottom w:color="bdc3c7" w:space="0" w:sz="4" w:val="single"/>
+              <w:right w:color="bdc3c7" w:space="0" w:sz="4" w:val="single"/>
+            </w:tcBorders>
+            <w:shd w:fill="2496ed" w:val="clear"/>
+            <w:tcMar>
+              <w:top w:w="80.0" w:type="dxa"/>
+              <w:left w:w="140.0" w:type="dxa"/>
+              <w:bottom w:w="80.0" w:type="dxa"/>
+              <w:right w:w="140.0" w:type="dxa"/>
+            </w:tcMar>
+          </w:tcPr>
+          <w:p>
+            <w:pPr>
+              <w:rPr>
+                <w:color w:val="ffffff"/>
+                <w:sz w:val="20"/>
+                <w:szCs w:val="20"/>
+              </w:rPr>
+            </w:pPr>
+            <w:r>
+              <w:rPr>
+                <w:color w:val="ffffff"/>
+                <w:sz w:val="20"/>
+                <w:szCs w:val="20"/>
+                <w:rtl w:val="0"/>
+              </w:rPr>
+              <w:t xml:space="preserve">Supabase Auth (GoTrue)</w:t>
+            </w:r>
+          </w:p>
+        </w:tc>
+        <w:tc>
+          <w:tcPr>
+            <w:tcBorders>
+              <w:top w:color="bdc3c7" w:space="0" w:sz="4" w:val="single"/>
+              <w:left w:color="bdc3c7" w:space="0" w:sz="4" w:val="single"/>
+              <w:bottom w:color="bdc3c7" w:space="0" w:sz="4" w:val="single"/>
+              <w:right w:color="bdc3c7" w:space="0" w:sz="4" w:val="single"/>
+            </w:tcBorders>
+            <w:shd w:fill="2496ed" w:val="clear"/>
+            <w:tcMar>
+              <w:top w:w="80.0" w:type="dxa"/>
+              <w:left w:w="140.0" w:type="dxa"/>
+              <w:bottom w:w="80.0" w:type="dxa"/>
+              <w:right w:w="140.0" w:type="dxa"/>
+            </w:tcMar>
+          </w:tcPr>
+          <w:p>
+            <w:pPr>
+              <w:rPr>
+                <w:color w:val="ffffff"/>
+                <w:sz w:val="20"/>
+                <w:szCs w:val="20"/>
+              </w:rPr>
+            </w:pPr>
+            <w:r>
+              <w:rPr>
+                <w:color w:val="ffffff"/>
+                <w:sz w:val="20"/>
+                <w:szCs w:val="20"/>
+                <w:rtl w:val="0"/>
+              </w:rPr>
+              <w:t xml:space="preserve">Gestión de identidad y tokens JWT</w:t>
+            </w:r>
+          </w:p>
+        </w:tc>
+      </w:tr>
+      <w:tr>
+        <w:trPr>
+          <w:cantSplit w:val="0"/>
+          <w:tblHeader w:val="0"/>
+        </w:trPr>
+        <w:tc>
+          <w:tcPr>
+            <w:tcBorders>
+              <w:top w:color="bdc3c7" w:space="0" w:sz="4" w:val="single"/>
+              <w:left w:color="bdc3c7" w:space="0" w:sz="4" w:val="single"/>
+              <w:bottom w:color="bdc3c7" w:space="0" w:sz="4" w:val="single"/>
+              <w:right w:color="bdc3c7" w:space="0" w:sz="4" w:val="single"/>
+            </w:tcBorders>
+            <w:shd w:fill="27ae60" w:val="clear"/>
+            <w:tcMar>
+              <w:top w:w="80.0" w:type="dxa"/>
+              <w:left w:w="140.0" w:type="dxa"/>
+              <w:bottom w:w="80.0" w:type="dxa"/>
+              <w:right w:w="140.0" w:type="dxa"/>
+            </w:tcMar>
+          </w:tcPr>
+          <w:p>
+            <w:pPr>
+              <w:rPr>
+                <w:color w:val="ffffff"/>
+                <w:sz w:val="20"/>
+                <w:szCs w:val="20"/>
+              </w:rPr>
+            </w:pPr>
+            <w:r>
+              <w:rPr>
+                <w:color w:val="ffffff"/>
+                <w:sz w:val="20"/>
+                <w:szCs w:val="20"/>
+                <w:rtl w:val="0"/>
+              </w:rPr>
+              <w:t xml:space="preserve">Worker</w:t>
+            </w:r>
+          </w:p>
+        </w:tc>
+        <w:tc>
+          <w:tcPr>
+            <w:tcBorders>
+              <w:top w:color="bdc3c7" w:space="0" w:sz="4" w:val="single"/>
+              <w:left w:color="bdc3c7" w:space="0" w:sz="4" w:val="single"/>
+              <w:bottom w:color="bdc3c7" w:space="0" w:sz="4" w:val="single"/>
+              <w:right w:color="bdc3c7" w:space="0" w:sz="4" w:val="single"/>
+            </w:tcBorders>
+            <w:shd w:fill="27ae60" w:val="clear"/>
+            <w:tcMar>
+              <w:top w:w="80.0" w:type="dxa"/>
+              <w:left w:w="140.0" w:type="dxa"/>
+              <w:bottom w:w="80.0" w:type="dxa"/>
+              <w:right w:w="140.0" w:type="dxa"/>
+            </w:tcMar>
+          </w:tcPr>
+          <w:p>
+            <w:pPr>
+              <w:rPr>
+                <w:color w:val="ffffff"/>
+                <w:sz w:val="20"/>
+                <w:szCs w:val="20"/>
+              </w:rPr>
+            </w:pPr>
+            <w:r>
+              <w:rPr>
+                <w:color w:val="ffffff"/>
+                <w:sz w:val="20"/>
+                <w:szCs w:val="20"/>
+                <w:rtl w:val="0"/>
+              </w:rPr>
+              <w:t xml:space="preserve">background process (Celery/RQ)</w:t>
+            </w:r>
+          </w:p>
+        </w:tc>
+        <w:tc>
+          <w:tcPr>
+            <w:tcBorders>
+              <w:top w:color="bdc3c7" w:space="0" w:sz="4" w:val="single"/>
+              <w:left w:color="bdc3c7" w:space="0" w:sz="4" w:val="single"/>
+              <w:bottom w:color="bdc3c7" w:space="0" w:sz="4" w:val="single"/>
+              <w:right w:color="bdc3c7" w:space="0" w:sz="4" w:val="single"/>
+            </w:tcBorders>
+            <w:shd w:fill="27ae60" w:val="clear"/>
+            <w:tcMar>
+              <w:top w:w="80.0" w:type="dxa"/>
+              <w:left w:w="140.0" w:type="dxa"/>
+              <w:bottom w:w="80.0" w:type="dxa"/>
+              <w:right w:w="140.0" w:type="dxa"/>
+            </w:tcMar>
+          </w:tcPr>
+          <w:p>
+            <w:pPr>
+              <w:rPr>
+                <w:color w:val="ffffff"/>
+                <w:sz w:val="20"/>
+                <w:szCs w:val="20"/>
+              </w:rPr>
+            </w:pPr>
+            <w:r>
+              <w:rPr>
+                <w:color w:val="ffffff"/>
+                <w:sz w:val="20"/>
+                <w:szCs w:val="20"/>
+                <w:rtl w:val="0"/>
+              </w:rPr>
+              <w:t xml:space="preserve">Proceso que desencola tareas y gestiona docker</w:t>
+            </w:r>
+          </w:p>
+        </w:tc>
+      </w:tr>
+      <w:tr>
+        <w:trPr>
+          <w:cantSplit w:val="0"/>
+          <w:tblHeader w:val="0"/>
+        </w:trPr>
+        <w:tc>
+          <w:tcPr>
+            <w:tcBorders>
+              <w:top w:color="bdc3c7" w:space="0" w:sz="4" w:val="single"/>
+              <w:left w:color="bdc3c7" w:space="0" w:sz="4" w:val="single"/>
+              <w:bottom w:color="ffffff" w:space="0" w:sz="4" w:val="single"/>
+              <w:right w:color="bdc3c7" w:space="0" w:sz="4" w:val="single"/>
+            </w:tcBorders>
+            <w:shd w:fill="999999" w:val="clear"/>
+            <w:tcMar>
+              <w:top w:w="80.0" w:type="dxa"/>
+              <w:left w:w="140.0" w:type="dxa"/>
+              <w:bottom w:w="80.0" w:type="dxa"/>
+              <w:right w:w="140.0" w:type="dxa"/>
+            </w:tcMar>
+          </w:tcPr>
+          <w:p>
+            <w:pPr>
+              <w:rPr>
+                <w:color w:val="ffffff"/>
+                <w:sz w:val="20"/>
+                <w:szCs w:val="20"/>
+              </w:rPr>
+            </w:pPr>
+            <w:r>
+              <w:rPr>
+                <w:color w:val="ffffff"/>
+                <w:sz w:val="20"/>
+                <w:szCs w:val="20"/>
+                <w:rtl w:val="0"/>
+              </w:rPr>
+              <w:t xml:space="preserve">Motor de ejecución</w:t>
+            </w:r>
+          </w:p>
+        </w:tc>
+        <w:tc>
+          <w:tcPr>
+            <w:tcBorders>
+              <w:top w:color="bdc3c7" w:space="0" w:sz="4" w:val="single"/>
+              <w:left w:color="bdc3c7" w:space="0" w:sz="4" w:val="single"/>
+              <w:bottom w:color="ffffff" w:space="0" w:sz="4" w:val="single"/>
+              <w:right w:color="bdc3c7" w:space="0" w:sz="4" w:val="single"/>
+            </w:tcBorders>
+            <w:shd w:fill="999999" w:val="clear"/>
+            <w:tcMar>
+              <w:top w:w="80.0" w:type="dxa"/>
+              <w:left w:w="140.0" w:type="dxa"/>
+              <w:bottom w:w="80.0" w:type="dxa"/>
+              <w:right w:w="140.0" w:type="dxa"/>
+            </w:tcMar>
+          </w:tcPr>
+          <w:p>
+            <w:pPr>
+              <w:rPr>
+                <w:color w:val="ffffff"/>
+                <w:sz w:val="20"/>
+                <w:szCs w:val="20"/>
+              </w:rPr>
+            </w:pPr>
+            <w:r>
+              <w:rPr>
+                <w:color w:val="ffffff"/>
+                <w:sz w:val="20"/>
+                <w:szCs w:val="20"/>
+                <w:rtl w:val="0"/>
+              </w:rPr>
+              <w:t xml:space="preserve">Software System (Host)</w:t>
+            </w:r>
+          </w:p>
+        </w:tc>
+        <w:tc>
+          <w:tcPr>
+            <w:tcBorders>
+              <w:top w:color="bdc3c7" w:space="0" w:sz="4" w:val="single"/>
+              <w:left w:color="bdc3c7" w:space="0" w:sz="4" w:val="single"/>
+              <w:bottom w:color="ffffff" w:space="0" w:sz="4" w:val="single"/>
+              <w:right w:color="bdc3c7" w:space="0" w:sz="4" w:val="single"/>
+            </w:tcBorders>
+            <w:shd w:fill="999999" w:val="clear"/>
+            <w:tcMar>
+              <w:top w:w="80.0" w:type="dxa"/>
+              <w:left w:w="140.0" w:type="dxa"/>
+              <w:bottom w:w="80.0" w:type="dxa"/>
+              <w:right w:w="140.0" w:type="dxa"/>
+            </w:tcMar>
+          </w:tcPr>
+          <w:p>
+            <w:pPr>
+              <w:rPr>
+                <w:color w:val="ffffff"/>
+                <w:sz w:val="20"/>
+                <w:szCs w:val="20"/>
+              </w:rPr>
+            </w:pPr>
+            <w:r>
+              <w:rPr>
+                <w:color w:val="ffffff"/>
+                <w:sz w:val="20"/>
+                <w:szCs w:val="20"/>
+                <w:rtl w:val="0"/>
+              </w:rPr>
+              <w:t xml:space="preserve">Docker Engine que gestiona los sandboxes aislados</w:t>
+            </w:r>
+          </w:p>
+        </w:tc>
+      </w:tr>
+      <w:tr>
+        <w:trPr>
+          <w:cantSplit w:val="0"/>
+          <w:tblHeader w:val="0"/>
+        </w:trPr>
+        <w:tc>
+          <w:tcPr>
+            <w:tcBorders>
+              <w:top w:color="ffffff" w:space="0" w:sz="4" w:val="single"/>
+              <w:left w:color="ffffff" w:space="0" w:sz="4" w:val="single"/>
+              <w:bottom w:color="ffffff" w:space="0" w:sz="4" w:val="single"/>
+              <w:right w:color="ffffff" w:space="0" w:sz="4" w:val="single"/>
+            </w:tcBorders>
+            <w:shd w:fill="800080" w:val="clear"/>
+            <w:tcMar>
+              <w:top w:w="80.0" w:type="dxa"/>
+              <w:left w:w="140.0" w:type="dxa"/>
+              <w:bottom w:w="80.0" w:type="dxa"/>
+              <w:right w:w="140.0" w:type="dxa"/>
+            </w:tcMar>
+          </w:tcPr>
+          <w:p>
+            <w:pPr>
+              <w:rPr>
+                <w:color w:val="ffffff"/>
+                <w:sz w:val="20"/>
+                <w:szCs w:val="20"/>
+              </w:rPr>
+            </w:pPr>
+            <w:r>
+              <w:rPr>
+                <w:color w:val="ffffff"/>
+                <w:sz w:val="20"/>
+                <w:szCs w:val="20"/>
+                <w:rtl w:val="0"/>
+              </w:rPr>
+              <w:t xml:space="preserve">Cola de tareas</w:t>
+            </w:r>
+          </w:p>
+        </w:tc>
+        <w:tc>
+          <w:tcPr>
+            <w:tcBorders>
+              <w:top w:color="ffffff" w:space="0" w:sz="4" w:val="single"/>
+              <w:left w:color="ffffff" w:space="0" w:sz="4" w:val="single"/>
+              <w:bottom w:color="ffffff" w:space="0" w:sz="4" w:val="single"/>
+              <w:right w:color="ffffff" w:space="0" w:sz="4" w:val="single"/>
+            </w:tcBorders>
+            <w:shd w:fill="800080" w:val="clear"/>
+            <w:tcMar>
+              <w:top w:w="80.0" w:type="dxa"/>
+              <w:left w:w="140.0" w:type="dxa"/>
+              <w:bottom w:w="80.0" w:type="dxa"/>
+              <w:right w:w="140.0" w:type="dxa"/>
+            </w:tcMar>
+          </w:tcPr>
+          <w:p>
+            <w:pPr>
+              <w:rPr>
+                <w:color w:val="ffffff"/>
+                <w:sz w:val="20"/>
+                <w:szCs w:val="20"/>
+              </w:rPr>
+            </w:pPr>
+            <w:r>
+              <w:rPr>
+                <w:color w:val="ffffff"/>
+                <w:sz w:val="20"/>
+                <w:szCs w:val="20"/>
+                <w:rtl w:val="0"/>
+              </w:rPr>
+              <w:t xml:space="preserve">Estructura de datos (Redis)</w:t>
+            </w:r>
+          </w:p>
+        </w:tc>
+        <w:tc>
+          <w:tcPr>
+            <w:tcBorders>
+              <w:top w:color="ffffff" w:space="0" w:sz="4" w:val="single"/>
+              <w:left w:color="ffffff" w:space="0" w:sz="4" w:val="single"/>
+              <w:bottom w:color="ffffff" w:space="0" w:sz="4" w:val="single"/>
+              <w:right w:color="ffffff" w:space="0" w:sz="4" w:val="single"/>
+            </w:tcBorders>
+            <w:shd w:fill="800080" w:val="clear"/>
+            <w:tcMar>
+              <w:top w:w="80.0" w:type="dxa"/>
+              <w:left w:w="140.0" w:type="dxa"/>
+              <w:bottom w:w="80.0" w:type="dxa"/>
+              <w:right w:w="140.0" w:type="dxa"/>
+            </w:tcMar>
+          </w:tcPr>
+          <w:p>
+            <w:pPr>
+              <w:rPr>
+                <w:color w:val="ffffff"/>
+                <w:sz w:val="20"/>
+                <w:szCs w:val="20"/>
+              </w:rPr>
+            </w:pPr>
+            <w:r>
+              <w:rPr>
+                <w:color w:val="ffffff"/>
+                <w:sz w:val="20"/>
+                <w:szCs w:val="20"/>
+                <w:rtl w:val="0"/>
+              </w:rPr>
+              <w:t xml:space="preserve">Almacena los ID’s de los envíos pendientes</w:t>
+            </w:r>
+          </w:p>
+        </w:tc>
+      </w:tr>
+      <w:tr>
+        <w:trPr>
+          <w:cantSplit w:val="0"/>
+          <w:tblHeader w:val="0"/>
+        </w:trPr>
+        <w:tc>
+          <w:tcPr>
+            <w:tcBorders>
+              <w:top w:color="ffffff" w:space="0" w:sz="4" w:val="single"/>
+              <w:left w:color="bdc3c7" w:space="0" w:sz="4" w:val="single"/>
+              <w:bottom w:color="bdc3c7" w:space="0" w:sz="4" w:val="single"/>
+              <w:right w:color="bdc3c7" w:space="0" w:sz="4" w:val="single"/>
+            </w:tcBorders>
+            <w:shd w:fill="ffa500" w:val="clear"/>
+            <w:tcMar>
+              <w:top w:w="80.0" w:type="dxa"/>
+              <w:left w:w="140.0" w:type="dxa"/>
+              <w:bottom w:w="80.0" w:type="dxa"/>
+              <w:right w:w="140.0" w:type="dxa"/>
+            </w:tcMar>
+          </w:tcPr>
+          <w:p>
+            <w:pPr>
+              <w:rPr>
+                <w:color w:val="ffffff"/>
+                <w:sz w:val="20"/>
+                <w:szCs w:val="20"/>
+              </w:rPr>
+            </w:pPr>
+            <w:r>
+              <w:rPr>
+                <w:color w:val="ffffff"/>
+                <w:sz w:val="20"/>
+                <w:szCs w:val="20"/>
+                <w:rtl w:val="0"/>
+              </w:rPr>
+              <w:t xml:space="preserve">Base de Datos</w:t>
+            </w:r>
+          </w:p>
+        </w:tc>
+        <w:tc>
+          <w:tcPr>
+            <w:tcBorders>
+              <w:top w:color="ffffff" w:space="0" w:sz="4" w:val="single"/>
+              <w:left w:color="bdc3c7" w:space="0" w:sz="4" w:val="single"/>
+              <w:bottom w:color="bdc3c7" w:space="0" w:sz="4" w:val="single"/>
+              <w:right w:color="bdc3c7" w:space="0" w:sz="4" w:val="single"/>
+            </w:tcBorders>
+            <w:shd w:fill="ffa500" w:val="clear"/>
+            <w:tcMar>
+              <w:top w:w="80.0" w:type="dxa"/>
+              <w:left w:w="140.0" w:type="dxa"/>
+              <w:bottom w:w="80.0" w:type="dxa"/>
+              <w:right w:w="140.0" w:type="dxa"/>
+            </w:tcMar>
+          </w:tcPr>
+          <w:p>
+            <w:pPr>
+              <w:rPr>
+                <w:color w:val="ffffff"/>
+                <w:sz w:val="20"/>
+                <w:szCs w:val="20"/>
+              </w:rPr>
+            </w:pPr>
+            <w:r>
+              <w:rPr>
+                <w:color w:val="ffffff"/>
+                <w:sz w:val="20"/>
+                <w:szCs w:val="20"/>
+                <w:rtl w:val="0"/>
+              </w:rPr>
+              <w:t xml:space="preserve">Almacén de Datos (PostgresQL)</w:t>
+            </w:r>
+          </w:p>
+        </w:tc>
+        <w:tc>
+          <w:tcPr>
+            <w:tcBorders>
+              <w:top w:color="ffffff" w:space="0" w:sz="4" w:val="single"/>
+              <w:left w:color="bdc3c7" w:space="0" w:sz="4" w:val="single"/>
+              <w:bottom w:color="bdc3c7" w:space="0" w:sz="4" w:val="single"/>
+              <w:right w:color="bdc3c7" w:space="0" w:sz="4" w:val="single"/>
+            </w:tcBorders>
+            <w:shd w:fill="ffa500" w:val="clear"/>
+            <w:tcMar>
+              <w:top w:w="80.0" w:type="dxa"/>
+              <w:left w:w="140.0" w:type="dxa"/>
+              <w:bottom w:w="80.0" w:type="dxa"/>
+              <w:right w:w="140.0" w:type="dxa"/>
+            </w:tcMar>
+          </w:tcPr>
+          <w:p>
+            <w:pPr>
+              <w:rPr>
+                <w:color w:val="ffffff"/>
+                <w:sz w:val="20"/>
+                <w:szCs w:val="20"/>
+              </w:rPr>
+            </w:pPr>
+            <w:r>
+              <w:rPr>
+                <w:color w:val="ffffff"/>
+                <w:sz w:val="20"/>
+                <w:szCs w:val="20"/>
+                <w:rtl w:val="0"/>
+              </w:rPr>
+              <w:t xml:space="preserve">Almacena perfiles, problemas y envios</w:t>
             </w:r>
           </w:p>
         </w:tc>
@@ -5557,9 +5976,6 @@
       <w:pPr>
         <w:rPr/>
       </w:pPr>
-      <w:r>
-        <w:br w:type="page"/>
-      </w:r>
       <w:r>
         <w:rPr>
           <w:rtl w:val="0"/>
@@ -6478,12 +6894,14 @@
     <w:p>
       <w:pPr>
         <w:spacing w:after="60" w:before="60" w:lineRule="auto"/>
-        <w:rPr/>
+        <w:rPr>
+          <w:color w:val="ffffff"/>
+        </w:rPr>
       </w:pPr>
       <w:r>
         <w:rPr>
           <w:rFonts w:ascii="Arial" w:cs="Arial" w:eastAsia="Arial" w:hAnsi="Arial"/>
-          <w:color w:val="1a1a2e"/>
+          <w:color w:val="ffffff"/>
           <w:sz w:val="22"/>
           <w:szCs w:val="22"/>
           <w:rtl w:val="0"/>
@@ -6495,46 +6913,47 @@
           <w:rtl w:val="0"/>
         </w:rPr>
       </w:r>
-    </w:p>
-    <w:p>
-      <w:pPr>
-        <w:spacing w:after="0" w:before="60" w:lineRule="auto"/>
-        <w:rPr/>
-      </w:pPr>
-      <w:r>
-        <w:rPr>
-          <w:rtl w:val="0"/>
-        </w:rPr>
-      </w:r>
-    </w:p>
-    <w:p>
-      <w:pPr>
-        <w:pBdr>
-          <w:top w:color="bdc3c7" w:space="0" w:sz="4" w:val="dashed"/>
-          <w:left w:color="bdc3c7" w:space="0" w:sz="4" w:val="dashed"/>
-          <w:bottom w:color="bdc3c7" w:space="0" w:sz="4" w:val="dashed"/>
-          <w:right w:color="bdc3c7" w:space="0" w:sz="4" w:val="dashed"/>
-        </w:pBdr>
-        <w:shd w:fill="f1f3f4" w:val="clear"/>
-        <w:spacing w:after="80" w:before="80" w:lineRule="auto"/>
-        <w:rPr/>
-      </w:pPr>
-      <w:r>
-        <w:rPr>
-          <w:rFonts w:ascii="Arial Unicode MS" w:cs="Arial Unicode MS" w:eastAsia="Arial Unicode MS" w:hAnsi="Arial Unicode MS"/>
-          <w:i w:val="1"/>
-          <w:iCs w:val="1"/>
-          <w:color w:val="888888"/>
-          <w:sz w:val="20"/>
-          <w:szCs w:val="20"/>
-          <w:rtl w:val="0"/>
-        </w:rPr>
-        <w:t xml:space="preserve">✏  Si aplica, insertar diagrama de clases UML o de secuencia para el componente más relevante (ej. flujo de autenticación, flujo de pago).</w:t>
-      </w:r>
-      <w:r>
-        <w:rPr>
-          <w:rtl w:val="0"/>
-        </w:rPr>
+      <w:r>
+        <w:drawing>
+          <wp:anchor allowOverlap="1" behindDoc="0" distB="114300" distT="114300" distL="114300" distR="114300" hidden="0" layoutInCell="1" locked="0" relativeHeight="0" simplePos="0">
+            <wp:simplePos x="0" y="0"/>
+            <wp:positionH relativeFrom="column">
+              <wp:posOffset>-695324</wp:posOffset>
+            </wp:positionH>
+            <wp:positionV relativeFrom="paragraph">
+              <wp:posOffset>276225</wp:posOffset>
+            </wp:positionV>
+            <wp:extent cx="7165491" cy="3226767"/>
+            <wp:effectExtent b="0" l="0" r="0" t="0"/>
+            <wp:wrapNone/>
+            <wp:docPr id="2" name="image2.png"/>
+            <a:graphic>
+              <a:graphicData uri="http://schemas.openxmlformats.org/drawingml/2006/picture">
+                <pic:pic>
+                  <pic:nvPicPr>
+                    <pic:cNvPr id="0" name="image2.png"/>
+                    <pic:cNvPicPr preferRelativeResize="0"/>
+                  </pic:nvPicPr>
+                  <pic:blipFill>
+                    <a:blip r:embed="rId8"/>
+                    <a:srcRect b="0" l="0" r="0" t="0"/>
+                    <a:stretch>
+                      <a:fillRect/>
+                    </a:stretch>
+                  </pic:blipFill>
+                  <pic:spPr>
+                    <a:xfrm>
+                      <a:off x="0" y="0"/>
+                      <a:ext cx="7165491" cy="3226767"/>
+                    </a:xfrm>
+                    <a:prstGeom prst="rect"/>
+                    <a:ln/>
+                  </pic:spPr>
+                </pic:pic>
+              </a:graphicData>
+            </a:graphic>
+          </wp:anchor>
+        </w:drawing>
       </w:r>
     </w:p>
     <w:p>
@@ -15173,7 +15592,7 @@
       </w:r>
     </w:p>
     <w:sectPr>
-      <w:footerReference r:id="rId8" w:type="default"/>
+      <w:footerReference r:id="rId9" w:type="default"/>
       <w:pgSz w:h="15840" w:w="12240" w:orient="portrait"/>
       <w:pgMar w:bottom="1440" w:top="1440" w:left="1440" w:right="1440" w:header="708" w:footer="708"/>
       <w:pgNumType w:start="1"/>

</xml_diff>

<commit_message>
Actualizacion documento de diseño v1.5
se pusieron los diagramas que mando camilo por whatsapp
</commit_message>
<xml_diff>
--- a/Documentacion/DisenoArquitectura.docx
+++ b/Documentacion/DisenoArquitectura.docx
@@ -137,7 +137,7 @@
           <w:szCs w:val="26"/>
           <w:rtl w:val="0"/>
         </w:rPr>
-        <w:t xml:space="preserve">4</w:t>
+        <w:t xml:space="preserve">5</w:t>
       </w:r>
       <w:r>
         <w:rPr>
@@ -1270,6 +1270,152 @@
           </w:p>
         </w:tc>
       </w:tr>
+      <w:tr>
+        <w:trPr>
+          <w:cantSplit w:val="0"/>
+          <w:tblHeader w:val="0"/>
+        </w:trPr>
+        <w:tc>
+          <w:tcPr>
+            <w:tcBorders>
+              <w:top w:color="bdc3c7" w:space="0" w:sz="4" w:val="single"/>
+              <w:left w:color="bdc3c7" w:space="0" w:sz="4" w:val="single"/>
+              <w:bottom w:color="bdc3c7" w:space="0" w:sz="4" w:val="single"/>
+              <w:right w:color="bdc3c7" w:space="0" w:sz="4" w:val="single"/>
+            </w:tcBorders>
+            <w:shd w:fill="ffffff" w:val="clear"/>
+            <w:tcMar>
+              <w:top w:w="80.0" w:type="dxa"/>
+              <w:left w:w="160.0" w:type="dxa"/>
+              <w:bottom w:w="80.0" w:type="dxa"/>
+              <w:right w:w="160.0" w:type="dxa"/>
+            </w:tcMar>
+          </w:tcPr>
+          <w:p>
+            <w:pPr>
+              <w:rPr>
+                <w:color w:val="000000"/>
+                <w:sz w:val="20"/>
+                <w:szCs w:val="20"/>
+              </w:rPr>
+            </w:pPr>
+            <w:r>
+              <w:rPr>
+                <w:color w:val="000000"/>
+                <w:sz w:val="20"/>
+                <w:szCs w:val="20"/>
+                <w:rtl w:val="0"/>
+              </w:rPr>
+              <w:t xml:space="preserve">Camilo</w:t>
+            </w:r>
+          </w:p>
+        </w:tc>
+        <w:tc>
+          <w:tcPr>
+            <w:tcBorders>
+              <w:top w:color="bdc3c7" w:space="0" w:sz="4" w:val="single"/>
+              <w:left w:color="bdc3c7" w:space="0" w:sz="4" w:val="single"/>
+              <w:bottom w:color="bdc3c7" w:space="0" w:sz="4" w:val="single"/>
+              <w:right w:color="bdc3c7" w:space="0" w:sz="4" w:val="single"/>
+            </w:tcBorders>
+            <w:shd w:fill="ffffff" w:val="clear"/>
+            <w:tcMar>
+              <w:top w:w="80.0" w:type="dxa"/>
+              <w:left w:w="160.0" w:type="dxa"/>
+              <w:bottom w:w="80.0" w:type="dxa"/>
+              <w:right w:w="160.0" w:type="dxa"/>
+            </w:tcMar>
+          </w:tcPr>
+          <w:p>
+            <w:pPr>
+              <w:rPr>
+                <w:color w:val="000000"/>
+                <w:sz w:val="20"/>
+                <w:szCs w:val="20"/>
+              </w:rPr>
+            </w:pPr>
+            <w:r>
+              <w:rPr>
+                <w:color w:val="000000"/>
+                <w:sz w:val="20"/>
+                <w:szCs w:val="20"/>
+                <w:rtl w:val="0"/>
+              </w:rPr>
+              <w:t xml:space="preserve">13/04/2026</w:t>
+            </w:r>
+          </w:p>
+        </w:tc>
+        <w:tc>
+          <w:tcPr>
+            <w:tcBorders>
+              <w:top w:color="bdc3c7" w:space="0" w:sz="4" w:val="single"/>
+              <w:left w:color="bdc3c7" w:space="0" w:sz="4" w:val="single"/>
+              <w:bottom w:color="bdc3c7" w:space="0" w:sz="4" w:val="single"/>
+              <w:right w:color="bdc3c7" w:space="0" w:sz="4" w:val="single"/>
+            </w:tcBorders>
+            <w:shd w:fill="ffffff" w:val="clear"/>
+            <w:tcMar>
+              <w:top w:w="80.0" w:type="dxa"/>
+              <w:left w:w="160.0" w:type="dxa"/>
+              <w:bottom w:w="80.0" w:type="dxa"/>
+              <w:right w:w="160.0" w:type="dxa"/>
+            </w:tcMar>
+          </w:tcPr>
+          <w:p>
+            <w:pPr>
+              <w:rPr>
+                <w:color w:val="000000"/>
+                <w:sz w:val="20"/>
+                <w:szCs w:val="20"/>
+              </w:rPr>
+            </w:pPr>
+            <w:r>
+              <w:rPr>
+                <w:color w:val="000000"/>
+                <w:sz w:val="20"/>
+                <w:szCs w:val="20"/>
+                <w:rtl w:val="0"/>
+              </w:rPr>
+              <w:t xml:space="preserve">Desarrollo de sección 2: Diagramas de código</w:t>
+            </w:r>
+          </w:p>
+        </w:tc>
+        <w:tc>
+          <w:tcPr>
+            <w:tcBorders>
+              <w:top w:color="bdc3c7" w:space="0" w:sz="4" w:val="single"/>
+              <w:left w:color="bdc3c7" w:space="0" w:sz="4" w:val="single"/>
+              <w:bottom w:color="bdc3c7" w:space="0" w:sz="4" w:val="single"/>
+              <w:right w:color="bdc3c7" w:space="0" w:sz="4" w:val="single"/>
+            </w:tcBorders>
+            <w:shd w:fill="ffffff" w:val="clear"/>
+            <w:tcMar>
+              <w:top w:w="80.0" w:type="dxa"/>
+              <w:left w:w="160.0" w:type="dxa"/>
+              <w:bottom w:w="80.0" w:type="dxa"/>
+              <w:right w:w="160.0" w:type="dxa"/>
+            </w:tcMar>
+          </w:tcPr>
+          <w:p>
+            <w:pPr>
+              <w:rPr>
+                <w:color w:val="000000"/>
+                <w:sz w:val="20"/>
+                <w:szCs w:val="20"/>
+              </w:rPr>
+            </w:pPr>
+            <w:r>
+              <w:rPr>
+                <w:color w:val="000000"/>
+                <w:sz w:val="20"/>
+                <w:szCs w:val="20"/>
+                <w:rtl w:val="0"/>
+              </w:rPr>
+              <w:t xml:space="preserve">1.5</w:t>
+            </w:r>
+          </w:p>
+        </w:tc>
+      </w:tr>
     </w:tbl>
     <w:p>
       <w:pPr>
@@ -1990,7 +2136,7 @@
                 <w:szCs w:val="20"/>
                 <w:rtl w:val="0"/>
               </w:rPr>
-              <w:t xml:space="preserve">Nivel 4 – Código (Opcional)</w:t>
+              <w:t xml:space="preserve">Nivel 4 – Código</w:t>
             </w:r>
             <w:r>
               <w:rPr>
@@ -4737,7 +4883,7 @@
           <wp:inline distB="114300" distT="114300" distL="114300" distR="114300">
             <wp:extent cx="5943600" cy="3898900"/>
             <wp:effectExtent b="0" l="0" r="0" t="0"/>
-            <wp:docPr id="3" name="image1.png"/>
+            <wp:docPr id="4" name="image1.png"/>
             <a:graphic>
               <a:graphicData uri="http://schemas.openxmlformats.org/drawingml/2006/picture">
                 <pic:pic>
@@ -6894,39 +7040,20 @@
     <w:p>
       <w:pPr>
         <w:spacing w:after="60" w:before="60" w:lineRule="auto"/>
+        <w:jc w:val="center"/>
         <w:rPr>
           <w:color w:val="ffffff"/>
         </w:rPr>
       </w:pPr>
       <w:r>
         <w:rPr>
-          <w:rFonts w:ascii="Arial" w:cs="Arial" w:eastAsia="Arial" w:hAnsi="Arial"/>
           <w:color w:val="ffffff"/>
-          <w:sz w:val="22"/>
-          <w:szCs w:val="22"/>
-          <w:rtl w:val="0"/>
-        </w:rPr>
-        <w:t xml:space="preserve">Este nivel es opcional y se recomienda solo para componentes críticos o de alta complejidad.</w:t>
-      </w:r>
-      <w:r>
-        <w:rPr>
-          <w:rtl w:val="0"/>
-        </w:rPr>
-      </w:r>
-      <w:r>
+        </w:rPr>
         <w:drawing>
-          <wp:anchor allowOverlap="1" behindDoc="0" distB="114300" distT="114300" distL="114300" distR="114300" hidden="0" layoutInCell="1" locked="0" relativeHeight="0" simplePos="0">
-            <wp:simplePos x="0" y="0"/>
-            <wp:positionH relativeFrom="column">
-              <wp:posOffset>-695324</wp:posOffset>
-            </wp:positionH>
-            <wp:positionV relativeFrom="paragraph">
-              <wp:posOffset>276225</wp:posOffset>
-            </wp:positionV>
-            <wp:extent cx="7165491" cy="3226767"/>
+          <wp:inline distB="114300" distT="114300" distL="114300" distR="114300">
+            <wp:extent cx="5887872" cy="3760167"/>
             <wp:effectExtent b="0" l="0" r="0" t="0"/>
-            <wp:wrapNone/>
-            <wp:docPr id="2" name="image2.png"/>
+            <wp:docPr id="3" name="image2.png"/>
             <a:graphic>
               <a:graphicData uri="http://schemas.openxmlformats.org/drawingml/2006/picture">
                 <pic:pic>
@@ -6936,6 +7063,66 @@
                   </pic:nvPicPr>
                   <pic:blipFill>
                     <a:blip r:embed="rId8"/>
+                    <a:srcRect b="0" l="0" r="0" t="2511"/>
+                    <a:stretch>
+                      <a:fillRect/>
+                    </a:stretch>
+                  </pic:blipFill>
+                  <pic:spPr>
+                    <a:xfrm>
+                      <a:off x="0" y="0"/>
+                      <a:ext cx="5887872" cy="3760167"/>
+                    </a:xfrm>
+                    <a:prstGeom prst="rect"/>
+                    <a:ln/>
+                  </pic:spPr>
+                </pic:pic>
+              </a:graphicData>
+            </a:graphic>
+          </wp:inline>
+        </w:drawing>
+      </w:r>
+      <w:r>
+        <w:rPr>
+          <w:rtl w:val="0"/>
+        </w:rPr>
+      </w:r>
+    </w:p>
+    <w:p>
+      <w:pPr>
+        <w:spacing w:after="60" w:before="60" w:lineRule="auto"/>
+        <w:jc w:val="center"/>
+        <w:rPr>
+          <w:color w:val="ffffff"/>
+        </w:rPr>
+      </w:pPr>
+      <w:r>
+        <w:rPr>
+          <w:rtl w:val="0"/>
+        </w:rPr>
+      </w:r>
+    </w:p>
+    <w:p>
+      <w:pPr>
+        <w:jc w:val="center"/>
+        <w:rPr/>
+      </w:pPr>
+      <w:r>
+        <w:rPr/>
+        <w:drawing>
+          <wp:inline distB="114300" distT="114300" distL="114300" distR="114300">
+            <wp:extent cx="5943600" cy="3848100"/>
+            <wp:effectExtent b="0" l="0" r="0" t="0"/>
+            <wp:docPr id="2" name="image4.png"/>
+            <a:graphic>
+              <a:graphicData uri="http://schemas.openxmlformats.org/drawingml/2006/picture">
+                <pic:pic>
+                  <pic:nvPicPr>
+                    <pic:cNvPr id="0" name="image4.png"/>
+                    <pic:cNvPicPr preferRelativeResize="0"/>
+                  </pic:nvPicPr>
+                  <pic:blipFill>
+                    <a:blip r:embed="rId9"/>
                     <a:srcRect b="0" l="0" r="0" t="0"/>
                     <a:stretch>
                       <a:fillRect/>
@@ -6944,7 +7131,7 @@
                   <pic:spPr>
                     <a:xfrm>
                       <a:off x="0" y="0"/>
-                      <a:ext cx="7165491" cy="3226767"/>
+                      <a:ext cx="5943600" cy="3848100"/>
                     </a:xfrm>
                     <a:prstGeom prst="rect"/>
                     <a:ln/>
@@ -6952,14 +7139,9 @@
                 </pic:pic>
               </a:graphicData>
             </a:graphic>
-          </wp:anchor>
+          </wp:inline>
         </w:drawing>
       </w:r>
-    </w:p>
-    <w:p>
-      <w:pPr>
-        <w:rPr/>
-      </w:pPr>
       <w:r>
         <w:br w:type="page"/>
       </w:r>
@@ -15592,7 +15774,7 @@
       </w:r>
     </w:p>
     <w:sectPr>
-      <w:footerReference r:id="rId9" w:type="default"/>
+      <w:footerReference r:id="rId10" w:type="default"/>
       <w:pgSz w:h="15840" w:w="12240" w:orient="portrait"/>
       <w:pgMar w:bottom="1440" w:top="1440" w:left="1440" w:right="1440" w:header="708" w:footer="708"/>
       <w:pgNumType w:start="1"/>

</xml_diff>